<commit_message>
fix(livrables): relecture complète — corrections L1/L5/L6
L1 - page_notifications.dart : commentaire 'swipe delete' → 'Effacer tout'
L1 - service_notifications.dart : 'in-app (ValueNotifier)' → 'Firebase + StreamSubscription'
L1 - Section 2.13 : suppression swipe-to-delete inexistant, bouton corrigé
     'Tout marquer comme lu' → 'Effacer tout', types STRING réels documentés
L5 - Section 4.3 chatbot : _messages corrigé de List<Map> vers List<ChatbotMessage>,
     sendMessage() avec paramètres nommés réels (messages, userName, userRole,
     userSector, userCity), msg['role']→msg.role, msg['content']→msg.content
L5 - Caption photo erronée : 'Swipe gauche pour supprimer' → caption correcte
L6 - Tableau fonctionnalités : 'swipe delete' → 'Effacer tout'
L6 - Caption notifications : 'swipe delete' → version correcte
L6 - Modèle IA : 'claude-haiku-4-5' → 'claude-haiku-4-5-20251001' (x2)
Régénération des 6 docx
</commit_message>
<xml_diff>
--- a/livrables/docx/DIAPALER_AFRICA_Livrable1.docx
+++ b/livrables/docx/DIAPALER_AFRICA_Livrable1.docx
@@ -2928,7 +2928,7 @@
                 <w:rFonts w:ascii="Courier New" w:hAnsi="Courier New"/>
                 <w:sz w:val="17"/>
               </w:rPr>
-              <w:t>│   │   ├── page_notifications.dart      # Centre de notifications + swipe delete</w:t>
+              <w:t>│   │   ├── page_notifications.dart      # Centre de notifications + badge + "Effacer tout"</w:t>
             </w:r>
           </w:p>
           <w:p>
@@ -3144,7 +3144,7 @@
                 <w:rFonts w:ascii="Courier New" w:hAnsi="Courier New"/>
                 <w:sz w:val="17"/>
               </w:rPr>
-              <w:t>│   │   ├── service_notifications.dart    # Notifications in-app (ValueNotifier)</w:t>
+              <w:t>│   │   ├── service_notifications.dart    # Notifications Firebase temps réel (ValueNotifier + StreamSubscription)</w:t>
             </w:r>
           </w:p>
           <w:p>
@@ -7452,7 +7452,7 @@
           <w:i w:val="0"/>
           <w:sz w:val="21"/>
         </w:rPr>
-        <w:t>Liste toutes les notifications (non lues en tête)</w:t>
+        <w:t>Liste toutes les notifications triées par date décroissante (Firebase temps réel)</w:t>
       </w:r>
     </w:p>
     <w:p>
@@ -7466,13 +7466,8 @@
           <w:i w:val="0"/>
           <w:sz w:val="21"/>
         </w:rPr>
-        <w:t>Icône et couleur selon le type : 💬 message / 📋 demande / 🚀 pitch / 📅 agenda / ⚙️ système</w:t>
-      </w:r>
-    </w:p>
-    <w:p>
-      <w:pPr>
-        <w:pStyle w:val="ListBullet"/>
-      </w:pPr>
+        <w:t xml:space="preserve">Icône et couleur distinctes selon le type (string) : </w:t>
+      </w:r>
       <w:r>
         <w:rPr>
           <w:rFonts w:ascii="Times New Roman" w:hAnsi="Times New Roman"/>
@@ -7480,13 +7475,8 @@
           <w:i w:val="0"/>
           <w:sz w:val="21"/>
         </w:rPr>
-        <w:t>Horodatage relatif ("il y a 5 min", "hier"…)</w:t>
-      </w:r>
-    </w:p>
-    <w:p>
-      <w:pPr>
-        <w:pStyle w:val="ListBullet"/>
-      </w:pPr>
+        <w:t>mentor_request</w:t>
+      </w:r>
       <w:r>
         <w:rPr>
           <w:rFonts w:ascii="Times New Roman" w:hAnsi="Times New Roman"/>
@@ -7494,13 +7484,8 @@
           <w:i w:val="0"/>
           <w:sz w:val="21"/>
         </w:rPr>
-        <w:t>Fond légèrement coloré pour les notifications non lues</w:t>
-      </w:r>
-    </w:p>
-    <w:p>
-      <w:pPr>
-        <w:pStyle w:val="ListBullet"/>
-      </w:pPr>
+        <w:t xml:space="preserve">, </w:t>
+      </w:r>
       <w:r>
         <w:rPr>
           <w:rFonts w:ascii="Times New Roman" w:hAnsi="Times New Roman"/>
@@ -7508,13 +7493,8 @@
           <w:i w:val="0"/>
           <w:sz w:val="21"/>
         </w:rPr>
-        <w:t>Bouton "Tout marquer comme lu"</w:t>
-      </w:r>
-    </w:p>
-    <w:p>
-      <w:pPr>
-        <w:pStyle w:val="ListBullet"/>
-      </w:pPr>
+        <w:t>session_booked</w:t>
+      </w:r>
       <w:r>
         <w:rPr>
           <w:rFonts w:ascii="Times New Roman" w:hAnsi="Times New Roman"/>
@@ -7522,7 +7502,103 @@
           <w:i w:val="0"/>
           <w:sz w:val="21"/>
         </w:rPr>
-        <w:t>Swipe-to-delete sur chaque notification</w:t>
+        <w:t xml:space="preserve">, </w:t>
+      </w:r>
+      <w:r>
+        <w:rPr>
+          <w:rFonts w:ascii="Times New Roman" w:hAnsi="Times New Roman"/>
+          <w:b w:val="0"/>
+          <w:i w:val="0"/>
+          <w:sz w:val="21"/>
+        </w:rPr>
+        <w:t>session_cancelled</w:t>
+      </w:r>
+      <w:r>
+        <w:rPr>
+          <w:rFonts w:ascii="Times New Roman" w:hAnsi="Times New Roman"/>
+          <w:b w:val="0"/>
+          <w:i w:val="0"/>
+          <w:sz w:val="21"/>
+        </w:rPr>
+        <w:t xml:space="preserve">, </w:t>
+      </w:r>
+      <w:r>
+        <w:rPr>
+          <w:rFonts w:ascii="Times New Roman" w:hAnsi="Times New Roman"/>
+          <w:b w:val="0"/>
+          <w:i w:val="0"/>
+          <w:sz w:val="21"/>
+        </w:rPr>
+        <w:t>message</w:t>
+      </w:r>
+      <w:r>
+        <w:rPr>
+          <w:rFonts w:ascii="Times New Roman" w:hAnsi="Times New Roman"/>
+          <w:b w:val="0"/>
+          <w:i w:val="0"/>
+          <w:sz w:val="21"/>
+        </w:rPr>
+        <w:t>…</w:t>
+      </w:r>
+    </w:p>
+    <w:p>
+      <w:pPr>
+        <w:pStyle w:val="ListBullet"/>
+      </w:pPr>
+      <w:r>
+        <w:rPr>
+          <w:rFonts w:ascii="Times New Roman" w:hAnsi="Times New Roman"/>
+          <w:b w:val="0"/>
+          <w:i w:val="0"/>
+          <w:sz w:val="21"/>
+        </w:rPr>
+        <w:t>Horodatage relatif ("Il y a 5m", "Il y a 2h"…)</w:t>
+      </w:r>
+    </w:p>
+    <w:p>
+      <w:pPr>
+        <w:pStyle w:val="ListBullet"/>
+      </w:pPr>
+      <w:r>
+        <w:rPr>
+          <w:rFonts w:ascii="Times New Roman" w:hAnsi="Times New Roman"/>
+          <w:b w:val="0"/>
+          <w:i w:val="0"/>
+          <w:sz w:val="21"/>
+        </w:rPr>
+        <w:t>Fond légèrement coloré pour les notifications non lues + point coloré</w:t>
+      </w:r>
+    </w:p>
+    <w:p>
+      <w:pPr>
+        <w:pStyle w:val="ListBullet"/>
+      </w:pPr>
+      <w:r>
+        <w:rPr>
+          <w:rFonts w:ascii="Times New Roman" w:hAnsi="Times New Roman"/>
+          <w:b w:val="0"/>
+          <w:i w:val="0"/>
+          <w:sz w:val="21"/>
+        </w:rPr>
+        <w:t xml:space="preserve">Bouton </w:t>
+      </w:r>
+      <w:r>
+        <w:rPr>
+          <w:rFonts w:ascii="Times New Roman" w:hAnsi="Times New Roman"/>
+          <w:b w:val="0"/>
+          <w:i w:val="0"/>
+          <w:sz w:val="21"/>
+        </w:rPr>
+        <w:t>"Effacer tout"</w:t>
+      </w:r>
+      <w:r>
+        <w:rPr>
+          <w:rFonts w:ascii="Times New Roman" w:hAnsi="Times New Roman"/>
+          <w:b w:val="0"/>
+          <w:i w:val="0"/>
+          <w:sz w:val="21"/>
+        </w:rPr>
+        <w:t xml:space="preserve"> → supprime le nœud Firebase</w:t>
       </w:r>
     </w:p>
     <w:p>

</xml_diff>

<commit_message>
feat(docx): ajouter des cadres placeholder pour les captures d'écran
- generer_docx.py : nouvelle fonction add_screenshot_placeholder()
- Chaque emplacement 📸 génère un cadre gris 7cm avec texte guide
- Les lignes 'Insérer ici la capture d'écran' sont absorbées automatiquement
- 6 docx régénérés avec les nouveaux cadres
</commit_message>
<xml_diff>
--- a/livrables/docx/DIAPALER_AFRICA_Livrable1.docx
+++ b/livrables/docx/DIAPALER_AFRICA_Livrable1.docx
@@ -1141,19 +1141,59 @@
     </w:p>
     <w:p>
       <w:pPr>
-        <w:pStyle w:val="Quote"/>
-        <w:ind w:left="567"/>
-      </w:pPr>
-      <w:r>
-        <w:rPr>
-          <w:rFonts w:ascii="Times New Roman" w:hAnsi="Times New Roman"/>
-          <w:b w:val="0"/>
+        <w:spacing w:before="120" w:after="40"/>
+      </w:pPr>
+      <w:r>
+        <w:rPr>
+          <w:rFonts w:ascii="Times New Roman" w:hAnsi="Times New Roman"/>
           <w:i/>
           <w:color w:val="606060"/>
-          <w:sz w:val="20"/>
-        </w:rPr>
-        <w:t>📸 [Insérer ici le logo de l'ESP et/ou une capture de l'application]</w:t>
-      </w:r>
+          <w:sz w:val="18"/>
+        </w:rPr>
+        <w:t>📸  [Insérer ici le logo de l'ESP et/ou une capture de l'application]</w:t>
+      </w:r>
+    </w:p>
+    <w:tbl>
+      <w:tblPr>
+        <w:tblStyle w:val="TableGrid"/>
+        <w:tblW w:type="auto" w:w="0"/>
+        <w:jc w:val="center"/>
+        <w:tblLook w:firstColumn="1" w:firstRow="1" w:lastColumn="0" w:lastRow="0" w:noHBand="0" w:noVBand="1" w:val="04A0"/>
+      </w:tblPr>
+      <w:tblGrid>
+        <w:gridCol w:w="9072"/>
+      </w:tblGrid>
+      <w:tr>
+        <w:trPr>
+          <w:trHeight w:val="3969" w:hRule="exact"/>
+        </w:trPr>
+        <w:tc>
+          <w:tcPr>
+            <w:tcW w:type="dxa" w:w="9072"/>
+            <w:shd w:val="clear" w:color="auto" w:fill="F0F0F0"/>
+          </w:tcPr>
+          <w:p>
+            <w:pPr>
+              <w:spacing w:before="1080"/>
+              <w:jc w:val="center"/>
+            </w:pPr>
+            <w:r>
+              <w:rPr>
+                <w:rFonts w:ascii="Times New Roman" w:hAnsi="Times New Roman"/>
+                <w:i/>
+                <w:color w:val="B0B0B0"/>
+                <w:sz w:val="20"/>
+              </w:rPr>
+              <w:t>[ Insérer la capture d'écran ici ]</w:t>
+            </w:r>
+          </w:p>
+        </w:tc>
+      </w:tr>
+    </w:tbl>
+    <w:p>
+      <w:pPr>
+        <w:spacing w:after="160"/>
+      </w:pPr>
     </w:p>
     <w:p>
       <w:pPr>
@@ -2444,35 +2484,59 @@
     </w:p>
     <w:p>
       <w:pPr>
-        <w:pStyle w:val="Quote"/>
-        <w:ind w:left="567"/>
-      </w:pPr>
-      <w:r>
-        <w:rPr>
-          <w:rFonts w:ascii="Times New Roman" w:hAnsi="Times New Roman"/>
-          <w:b w:val="0"/>
+        <w:spacing w:before="120" w:after="40"/>
+      </w:pPr>
+      <w:r>
+        <w:rPr>
+          <w:rFonts w:ascii="Times New Roman" w:hAnsi="Times New Roman"/>
           <w:i/>
           <w:color w:val="606060"/>
-          <w:sz w:val="20"/>
-        </w:rPr>
-        <w:t>📸 CAPTURE D'ÉCRAN — Fichier pubspec.yaml ouvert dans VS Code</w:t>
-      </w:r>
-    </w:p>
-    <w:p>
-      <w:pPr>
-        <w:pStyle w:val="Quote"/>
-        <w:ind w:left="567"/>
-      </w:pPr>
-      <w:r>
-        <w:rPr>
-          <w:rFonts w:ascii="Times New Roman" w:hAnsi="Times New Roman"/>
-          <w:b w:val="0"/>
-          <w:i/>
-          <w:color w:val="606060"/>
-          <w:sz w:val="20"/>
-        </w:rPr>
-        <w:t>(Insérer ici la capture d'écran)</w:t>
-      </w:r>
+          <w:sz w:val="18"/>
+        </w:rPr>
+        <w:t>📸  Fichier pubspec.yaml ouvert dans VS Code</w:t>
+      </w:r>
+    </w:p>
+    <w:tbl>
+      <w:tblPr>
+        <w:tblStyle w:val="TableGrid"/>
+        <w:tblW w:type="auto" w:w="0"/>
+        <w:jc w:val="center"/>
+        <w:tblLook w:firstColumn="1" w:firstRow="1" w:lastColumn="0" w:lastRow="0" w:noHBand="0" w:noVBand="1" w:val="04A0"/>
+      </w:tblPr>
+      <w:tblGrid>
+        <w:gridCol w:w="9072"/>
+      </w:tblGrid>
+      <w:tr>
+        <w:trPr>
+          <w:trHeight w:val="3969" w:hRule="exact"/>
+        </w:trPr>
+        <w:tc>
+          <w:tcPr>
+            <w:tcW w:type="dxa" w:w="9072"/>
+            <w:shd w:val="clear" w:color="auto" w:fill="F0F0F0"/>
+          </w:tcPr>
+          <w:p>
+            <w:pPr>
+              <w:spacing w:before="1080"/>
+              <w:jc w:val="center"/>
+            </w:pPr>
+            <w:r>
+              <w:rPr>
+                <w:rFonts w:ascii="Times New Roman" w:hAnsi="Times New Roman"/>
+                <w:i/>
+                <w:color w:val="B0B0B0"/>
+                <w:sz w:val="20"/>
+              </w:rPr>
+              <w:t>[ Insérer la capture d'écran ici ]</w:t>
+            </w:r>
+          </w:p>
+        </w:tc>
+      </w:tr>
+    </w:tbl>
+    <w:p>
+      <w:pPr>
+        <w:spacing w:after="160"/>
+      </w:pPr>
     </w:p>
     <w:p>
       <w:pPr>
@@ -3517,35 +3581,59 @@
     </w:p>
     <w:p>
       <w:pPr>
-        <w:pStyle w:val="Quote"/>
-        <w:ind w:left="567"/>
-      </w:pPr>
-      <w:r>
-        <w:rPr>
-          <w:rFonts w:ascii="Times New Roman" w:hAnsi="Times New Roman"/>
-          <w:b w:val="0"/>
+        <w:spacing w:before="120" w:after="40"/>
+      </w:pPr>
+      <w:r>
+        <w:rPr>
+          <w:rFonts w:ascii="Times New Roman" w:hAnsi="Times New Roman"/>
           <w:i/>
           <w:color w:val="606060"/>
-          <w:sz w:val="20"/>
-        </w:rPr>
-        <w:t>📸 CAPTURE D'ÉCRAN — Structure du projet dans l'explorateur VS Code</w:t>
-      </w:r>
-    </w:p>
-    <w:p>
-      <w:pPr>
-        <w:pStyle w:val="Quote"/>
-        <w:ind w:left="567"/>
-      </w:pPr>
-      <w:r>
-        <w:rPr>
-          <w:rFonts w:ascii="Times New Roman" w:hAnsi="Times New Roman"/>
-          <w:b w:val="0"/>
-          <w:i/>
-          <w:color w:val="606060"/>
-          <w:sz w:val="20"/>
-        </w:rPr>
-        <w:t>(Insérer ici la capture d'écran)</w:t>
-      </w:r>
+          <w:sz w:val="18"/>
+        </w:rPr>
+        <w:t>📸  Structure du projet dans l'explorateur VS Code</w:t>
+      </w:r>
+    </w:p>
+    <w:tbl>
+      <w:tblPr>
+        <w:tblStyle w:val="TableGrid"/>
+        <w:tblW w:type="auto" w:w="0"/>
+        <w:jc w:val="center"/>
+        <w:tblLook w:firstColumn="1" w:firstRow="1" w:lastColumn="0" w:lastRow="0" w:noHBand="0" w:noVBand="1" w:val="04A0"/>
+      </w:tblPr>
+      <w:tblGrid>
+        <w:gridCol w:w="9072"/>
+      </w:tblGrid>
+      <w:tr>
+        <w:trPr>
+          <w:trHeight w:val="3969" w:hRule="exact"/>
+        </w:trPr>
+        <w:tc>
+          <w:tcPr>
+            <w:tcW w:type="dxa" w:w="9072"/>
+            <w:shd w:val="clear" w:color="auto" w:fill="F0F0F0"/>
+          </w:tcPr>
+          <w:p>
+            <w:pPr>
+              <w:spacing w:before="1080"/>
+              <w:jc w:val="center"/>
+            </w:pPr>
+            <w:r>
+              <w:rPr>
+                <w:rFonts w:ascii="Times New Roman" w:hAnsi="Times New Roman"/>
+                <w:i/>
+                <w:color w:val="B0B0B0"/>
+                <w:sz w:val="20"/>
+              </w:rPr>
+              <w:t>[ Insérer la capture d'écran ici ]</w:t>
+            </w:r>
+          </w:p>
+        </w:tc>
+      </w:tr>
+    </w:tbl>
+    <w:p>
+      <w:pPr>
+        <w:spacing w:after="160"/>
+      </w:pPr>
     </w:p>
     <w:p>
       <w:pPr>
@@ -4492,35 +4580,59 @@
     </w:p>
     <w:p>
       <w:pPr>
-        <w:pStyle w:val="Quote"/>
-        <w:ind w:left="567"/>
-      </w:pPr>
-      <w:r>
-        <w:rPr>
-          <w:rFonts w:ascii="Times New Roman" w:hAnsi="Times New Roman"/>
-          <w:b w:val="0"/>
+        <w:spacing w:before="120" w:after="40"/>
+      </w:pPr>
+      <w:r>
+        <w:rPr>
+          <w:rFonts w:ascii="Times New Roman" w:hAnsi="Times New Roman"/>
           <w:i/>
           <w:color w:val="606060"/>
-          <w:sz w:val="20"/>
-        </w:rPr>
-        <w:t>📸 CAPTURE D'ÉCRAN — Application lancée sur émulateur Android / Chrome</w:t>
-      </w:r>
-    </w:p>
-    <w:p>
-      <w:pPr>
-        <w:pStyle w:val="Quote"/>
-        <w:ind w:left="567"/>
-      </w:pPr>
-      <w:r>
-        <w:rPr>
-          <w:rFonts w:ascii="Times New Roman" w:hAnsi="Times New Roman"/>
-          <w:b w:val="0"/>
-          <w:i/>
-          <w:color w:val="606060"/>
-          <w:sz w:val="20"/>
-        </w:rPr>
-        <w:t>(Insérer ici la capture d'écran)</w:t>
-      </w:r>
+          <w:sz w:val="18"/>
+        </w:rPr>
+        <w:t>📸  Application lancée sur émulateur Android / Chrome</w:t>
+      </w:r>
+    </w:p>
+    <w:tbl>
+      <w:tblPr>
+        <w:tblStyle w:val="TableGrid"/>
+        <w:tblW w:type="auto" w:w="0"/>
+        <w:jc w:val="center"/>
+        <w:tblLook w:firstColumn="1" w:firstRow="1" w:lastColumn="0" w:lastRow="0" w:noHBand="0" w:noVBand="1" w:val="04A0"/>
+      </w:tblPr>
+      <w:tblGrid>
+        <w:gridCol w:w="9072"/>
+      </w:tblGrid>
+      <w:tr>
+        <w:trPr>
+          <w:trHeight w:val="3969" w:hRule="exact"/>
+        </w:trPr>
+        <w:tc>
+          <w:tcPr>
+            <w:tcW w:type="dxa" w:w="9072"/>
+            <w:shd w:val="clear" w:color="auto" w:fill="F0F0F0"/>
+          </w:tcPr>
+          <w:p>
+            <w:pPr>
+              <w:spacing w:before="1080"/>
+              <w:jc w:val="center"/>
+            </w:pPr>
+            <w:r>
+              <w:rPr>
+                <w:rFonts w:ascii="Times New Roman" w:hAnsi="Times New Roman"/>
+                <w:i/>
+                <w:color w:val="B0B0B0"/>
+                <w:sz w:val="20"/>
+              </w:rPr>
+              <w:t>[ Insérer la capture d'écran ici ]</w:t>
+            </w:r>
+          </w:p>
+        </w:tc>
+      </w:tr>
+    </w:tbl>
+    <w:p>
+      <w:pPr>
+        <w:spacing w:after="160"/>
+      </w:pPr>
     </w:p>
     <w:p>
       <w:pPr>
@@ -5113,35 +5225,59 @@
     </w:p>
     <w:p>
       <w:pPr>
-        <w:pStyle w:val="Quote"/>
-        <w:ind w:left="567"/>
-      </w:pPr>
-      <w:r>
-        <w:rPr>
-          <w:rFonts w:ascii="Times New Roman" w:hAnsi="Times New Roman"/>
-          <w:b w:val="0"/>
+        <w:spacing w:before="120" w:after="40"/>
+      </w:pPr>
+      <w:r>
+        <w:rPr>
+          <w:rFonts w:ascii="Times New Roman" w:hAnsi="Times New Roman"/>
           <w:i/>
           <w:color w:val="606060"/>
-          <w:sz w:val="20"/>
-        </w:rPr>
-        <w:t>📸 CAPTURE D'ÉCRAN — Design System : palette de couleurs visible dans l'app</w:t>
-      </w:r>
-    </w:p>
-    <w:p>
-      <w:pPr>
-        <w:pStyle w:val="Quote"/>
-        <w:ind w:left="567"/>
-      </w:pPr>
-      <w:r>
-        <w:rPr>
-          <w:rFonts w:ascii="Times New Roman" w:hAnsi="Times New Roman"/>
-          <w:b w:val="0"/>
-          <w:i/>
-          <w:color w:val="606060"/>
-          <w:sz w:val="20"/>
-        </w:rPr>
-        <w:t>(Insérer ici la capture d'écran)</w:t>
-      </w:r>
+          <w:sz w:val="18"/>
+        </w:rPr>
+        <w:t>📸  Design System : palette de couleurs visible dans l'app</w:t>
+      </w:r>
+    </w:p>
+    <w:tbl>
+      <w:tblPr>
+        <w:tblStyle w:val="TableGrid"/>
+        <w:tblW w:type="auto" w:w="0"/>
+        <w:jc w:val="center"/>
+        <w:tblLook w:firstColumn="1" w:firstRow="1" w:lastColumn="0" w:lastRow="0" w:noHBand="0" w:noVBand="1" w:val="04A0"/>
+      </w:tblPr>
+      <w:tblGrid>
+        <w:gridCol w:w="9072"/>
+      </w:tblGrid>
+      <w:tr>
+        <w:trPr>
+          <w:trHeight w:val="3969" w:hRule="exact"/>
+        </w:trPr>
+        <w:tc>
+          <w:tcPr>
+            <w:tcW w:type="dxa" w:w="9072"/>
+            <w:shd w:val="clear" w:color="auto" w:fill="F0F0F0"/>
+          </w:tcPr>
+          <w:p>
+            <w:pPr>
+              <w:spacing w:before="1080"/>
+              <w:jc w:val="center"/>
+            </w:pPr>
+            <w:r>
+              <w:rPr>
+                <w:rFonts w:ascii="Times New Roman" w:hAnsi="Times New Roman"/>
+                <w:i/>
+                <w:color w:val="B0B0B0"/>
+                <w:sz w:val="20"/>
+              </w:rPr>
+              <w:t>[ Insérer la capture d'écran ici ]</w:t>
+            </w:r>
+          </w:p>
+        </w:tc>
+      </w:tr>
+    </w:tbl>
+    <w:p>
+      <w:pPr>
+        <w:spacing w:after="160"/>
+      </w:pPr>
     </w:p>
     <w:p>
       <w:pPr>
@@ -5274,35 +5410,59 @@
     </w:p>
     <w:p>
       <w:pPr>
-        <w:pStyle w:val="Quote"/>
-        <w:ind w:left="567"/>
-      </w:pPr>
-      <w:r>
-        <w:rPr>
-          <w:rFonts w:ascii="Times New Roman" w:hAnsi="Times New Roman"/>
-          <w:b w:val="0"/>
+        <w:spacing w:before="120" w:after="40"/>
+      </w:pPr>
+      <w:r>
+        <w:rPr>
+          <w:rFonts w:ascii="Times New Roman" w:hAnsi="Times New Roman"/>
           <w:i/>
           <w:color w:val="606060"/>
-          <w:sz w:val="20"/>
-        </w:rPr>
-        <w:t>📸 CAPTURE D'ÉCRAN — Écran de démarrage (Splash Screen)</w:t>
-      </w:r>
-    </w:p>
-    <w:p>
-      <w:pPr>
-        <w:pStyle w:val="Quote"/>
-        <w:ind w:left="567"/>
-      </w:pPr>
-      <w:r>
-        <w:rPr>
-          <w:rFonts w:ascii="Times New Roman" w:hAnsi="Times New Roman"/>
-          <w:b w:val="0"/>
-          <w:i/>
-          <w:color w:val="606060"/>
-          <w:sz w:val="20"/>
-        </w:rPr>
-        <w:t>(Insérer ici la capture d'écran)</w:t>
-      </w:r>
+          <w:sz w:val="18"/>
+        </w:rPr>
+        <w:t>📸  Écran de démarrage (Splash Screen)</w:t>
+      </w:r>
+    </w:p>
+    <w:tbl>
+      <w:tblPr>
+        <w:tblStyle w:val="TableGrid"/>
+        <w:tblW w:type="auto" w:w="0"/>
+        <w:jc w:val="center"/>
+        <w:tblLook w:firstColumn="1" w:firstRow="1" w:lastColumn="0" w:lastRow="0" w:noHBand="0" w:noVBand="1" w:val="04A0"/>
+      </w:tblPr>
+      <w:tblGrid>
+        <w:gridCol w:w="9072"/>
+      </w:tblGrid>
+      <w:tr>
+        <w:trPr>
+          <w:trHeight w:val="3969" w:hRule="exact"/>
+        </w:trPr>
+        <w:tc>
+          <w:tcPr>
+            <w:tcW w:type="dxa" w:w="9072"/>
+            <w:shd w:val="clear" w:color="auto" w:fill="F0F0F0"/>
+          </w:tcPr>
+          <w:p>
+            <w:pPr>
+              <w:spacing w:before="1080"/>
+              <w:jc w:val="center"/>
+            </w:pPr>
+            <w:r>
+              <w:rPr>
+                <w:rFonts w:ascii="Times New Roman" w:hAnsi="Times New Roman"/>
+                <w:i/>
+                <w:color w:val="B0B0B0"/>
+                <w:sz w:val="20"/>
+              </w:rPr>
+              <w:t>[ Insérer la capture d'écran ici ]</w:t>
+            </w:r>
+          </w:p>
+        </w:tc>
+      </w:tr>
+    </w:tbl>
+    <w:p>
+      <w:pPr>
+        <w:spacing w:after="160"/>
+      </w:pPr>
     </w:p>
     <w:p>
       <w:pPr>
@@ -5449,35 +5609,59 @@
     </w:p>
     <w:p>
       <w:pPr>
-        <w:pStyle w:val="Quote"/>
-        <w:ind w:left="567"/>
-      </w:pPr>
-      <w:r>
-        <w:rPr>
-          <w:rFonts w:ascii="Times New Roman" w:hAnsi="Times New Roman"/>
-          <w:b w:val="0"/>
+        <w:spacing w:before="120" w:after="40"/>
+      </w:pPr>
+      <w:r>
+        <w:rPr>
+          <w:rFonts w:ascii="Times New Roman" w:hAnsi="Times New Roman"/>
           <w:i/>
           <w:color w:val="606060"/>
-          <w:sz w:val="20"/>
-        </w:rPr>
-        <w:t>📸 CAPTURE D'ÉCRAN — Écran d'Onboarding (slide 1)</w:t>
-      </w:r>
-    </w:p>
-    <w:p>
-      <w:pPr>
-        <w:pStyle w:val="Quote"/>
-        <w:ind w:left="567"/>
-      </w:pPr>
-      <w:r>
-        <w:rPr>
-          <w:rFonts w:ascii="Times New Roman" w:hAnsi="Times New Roman"/>
-          <w:b w:val="0"/>
-          <w:i/>
-          <w:color w:val="606060"/>
-          <w:sz w:val="20"/>
-        </w:rPr>
-        <w:t>(Insérer ici la capture d'écran)</w:t>
-      </w:r>
+          <w:sz w:val="18"/>
+        </w:rPr>
+        <w:t>📸  Écran d'Onboarding (slide 1)</w:t>
+      </w:r>
+    </w:p>
+    <w:tbl>
+      <w:tblPr>
+        <w:tblStyle w:val="TableGrid"/>
+        <w:tblW w:type="auto" w:w="0"/>
+        <w:jc w:val="center"/>
+        <w:tblLook w:firstColumn="1" w:firstRow="1" w:lastColumn="0" w:lastRow="0" w:noHBand="0" w:noVBand="1" w:val="04A0"/>
+      </w:tblPr>
+      <w:tblGrid>
+        <w:gridCol w:w="9072"/>
+      </w:tblGrid>
+      <w:tr>
+        <w:trPr>
+          <w:trHeight w:val="3969" w:hRule="exact"/>
+        </w:trPr>
+        <w:tc>
+          <w:tcPr>
+            <w:tcW w:type="dxa" w:w="9072"/>
+            <w:shd w:val="clear" w:color="auto" w:fill="F0F0F0"/>
+          </w:tcPr>
+          <w:p>
+            <w:pPr>
+              <w:spacing w:before="1080"/>
+              <w:jc w:val="center"/>
+            </w:pPr>
+            <w:r>
+              <w:rPr>
+                <w:rFonts w:ascii="Times New Roman" w:hAnsi="Times New Roman"/>
+                <w:i/>
+                <w:color w:val="B0B0B0"/>
+                <w:sz w:val="20"/>
+              </w:rPr>
+              <w:t>[ Insérer la capture d'écran ici ]</w:t>
+            </w:r>
+          </w:p>
+        </w:tc>
+      </w:tr>
+    </w:tbl>
+    <w:p>
+      <w:pPr>
+        <w:spacing w:after="160"/>
+      </w:pPr>
     </w:p>
     <w:p>
       <w:pPr>
@@ -5678,35 +5862,59 @@
     </w:p>
     <w:p>
       <w:pPr>
-        <w:pStyle w:val="Quote"/>
-        <w:ind w:left="567"/>
-      </w:pPr>
-      <w:r>
-        <w:rPr>
-          <w:rFonts w:ascii="Times New Roman" w:hAnsi="Times New Roman"/>
-          <w:b w:val="0"/>
+        <w:spacing w:before="120" w:after="40"/>
+      </w:pPr>
+      <w:r>
+        <w:rPr>
+          <w:rFonts w:ascii="Times New Roman" w:hAnsi="Times New Roman"/>
           <w:i/>
           <w:color w:val="606060"/>
-          <w:sz w:val="20"/>
-        </w:rPr>
-        <w:t>📸 CAPTURE D'ÉCRAN — Écran de Choix du Rôle (3 tuiles)</w:t>
-      </w:r>
-    </w:p>
-    <w:p>
-      <w:pPr>
-        <w:pStyle w:val="Quote"/>
-        <w:ind w:left="567"/>
-      </w:pPr>
-      <w:r>
-        <w:rPr>
-          <w:rFonts w:ascii="Times New Roman" w:hAnsi="Times New Roman"/>
-          <w:b w:val="0"/>
-          <w:i/>
-          <w:color w:val="606060"/>
-          <w:sz w:val="20"/>
-        </w:rPr>
-        <w:t>(Insérer ici la capture d'écran)</w:t>
-      </w:r>
+          <w:sz w:val="18"/>
+        </w:rPr>
+        <w:t>📸  Écran de Choix du Rôle (3 tuiles)</w:t>
+      </w:r>
+    </w:p>
+    <w:tbl>
+      <w:tblPr>
+        <w:tblStyle w:val="TableGrid"/>
+        <w:tblW w:type="auto" w:w="0"/>
+        <w:jc w:val="center"/>
+        <w:tblLook w:firstColumn="1" w:firstRow="1" w:lastColumn="0" w:lastRow="0" w:noHBand="0" w:noVBand="1" w:val="04A0"/>
+      </w:tblPr>
+      <w:tblGrid>
+        <w:gridCol w:w="9072"/>
+      </w:tblGrid>
+      <w:tr>
+        <w:trPr>
+          <w:trHeight w:val="3969" w:hRule="exact"/>
+        </w:trPr>
+        <w:tc>
+          <w:tcPr>
+            <w:tcW w:type="dxa" w:w="9072"/>
+            <w:shd w:val="clear" w:color="auto" w:fill="F0F0F0"/>
+          </w:tcPr>
+          <w:p>
+            <w:pPr>
+              <w:spacing w:before="1080"/>
+              <w:jc w:val="center"/>
+            </w:pPr>
+            <w:r>
+              <w:rPr>
+                <w:rFonts w:ascii="Times New Roman" w:hAnsi="Times New Roman"/>
+                <w:i/>
+                <w:color w:val="B0B0B0"/>
+                <w:sz w:val="20"/>
+              </w:rPr>
+              <w:t>[ Insérer la capture d'écran ici ]</w:t>
+            </w:r>
+          </w:p>
+        </w:tc>
+      </w:tr>
+    </w:tbl>
+    <w:p>
+      <w:pPr>
+        <w:spacing w:after="160"/>
+      </w:pPr>
     </w:p>
     <w:p>
       <w:pPr>
@@ -5885,35 +6093,59 @@
     </w:p>
     <w:p>
       <w:pPr>
-        <w:pStyle w:val="Quote"/>
-        <w:ind w:left="567"/>
-      </w:pPr>
-      <w:r>
-        <w:rPr>
-          <w:rFonts w:ascii="Times New Roman" w:hAnsi="Times New Roman"/>
-          <w:b w:val="0"/>
+        <w:spacing w:before="120" w:after="40"/>
+      </w:pPr>
+      <w:r>
+        <w:rPr>
+          <w:rFonts w:ascii="Times New Roman" w:hAnsi="Times New Roman"/>
           <w:i/>
           <w:color w:val="606060"/>
-          <w:sz w:val="20"/>
-        </w:rPr>
-        <w:t>📸 CAPTURE D'ÉCRAN — Écran de Connexion</w:t>
-      </w:r>
-    </w:p>
-    <w:p>
-      <w:pPr>
-        <w:pStyle w:val="Quote"/>
-        <w:ind w:left="567"/>
-      </w:pPr>
-      <w:r>
-        <w:rPr>
-          <w:rFonts w:ascii="Times New Roman" w:hAnsi="Times New Roman"/>
-          <w:b w:val="0"/>
-          <w:i/>
-          <w:color w:val="606060"/>
-          <w:sz w:val="20"/>
-        </w:rPr>
-        <w:t>(Insérer ici la capture d'écran)</w:t>
-      </w:r>
+          <w:sz w:val="18"/>
+        </w:rPr>
+        <w:t>📸  Écran de Connexion</w:t>
+      </w:r>
+    </w:p>
+    <w:tbl>
+      <w:tblPr>
+        <w:tblStyle w:val="TableGrid"/>
+        <w:tblW w:type="auto" w:w="0"/>
+        <w:jc w:val="center"/>
+        <w:tblLook w:firstColumn="1" w:firstRow="1" w:lastColumn="0" w:lastRow="0" w:noHBand="0" w:noVBand="1" w:val="04A0"/>
+      </w:tblPr>
+      <w:tblGrid>
+        <w:gridCol w:w="9072"/>
+      </w:tblGrid>
+      <w:tr>
+        <w:trPr>
+          <w:trHeight w:val="3969" w:hRule="exact"/>
+        </w:trPr>
+        <w:tc>
+          <w:tcPr>
+            <w:tcW w:type="dxa" w:w="9072"/>
+            <w:shd w:val="clear" w:color="auto" w:fill="F0F0F0"/>
+          </w:tcPr>
+          <w:p>
+            <w:pPr>
+              <w:spacing w:before="1080"/>
+              <w:jc w:val="center"/>
+            </w:pPr>
+            <w:r>
+              <w:rPr>
+                <w:rFonts w:ascii="Times New Roman" w:hAnsi="Times New Roman"/>
+                <w:i/>
+                <w:color w:val="B0B0B0"/>
+                <w:sz w:val="20"/>
+              </w:rPr>
+              <w:t>[ Insérer la capture d'écran ici ]</w:t>
+            </w:r>
+          </w:p>
+        </w:tc>
+      </w:tr>
+    </w:tbl>
+    <w:p>
+      <w:pPr>
+        <w:spacing w:after="160"/>
+      </w:pPr>
     </w:p>
     <w:p>
       <w:pPr>
@@ -6074,67 +6306,115 @@
     </w:p>
     <w:p>
       <w:pPr>
-        <w:pStyle w:val="Quote"/>
-        <w:ind w:left="567"/>
-      </w:pPr>
-      <w:r>
-        <w:rPr>
-          <w:rFonts w:ascii="Times New Roman" w:hAnsi="Times New Roman"/>
-          <w:b w:val="0"/>
+        <w:spacing w:before="120" w:after="40"/>
+      </w:pPr>
+      <w:r>
+        <w:rPr>
+          <w:rFonts w:ascii="Times New Roman" w:hAnsi="Times New Roman"/>
           <w:i/>
           <w:color w:val="606060"/>
-          <w:sz w:val="20"/>
-        </w:rPr>
-        <w:t>📸 CAPTURE D'ÉCRAN — Inscription Étape 1 (Identité)</w:t>
-      </w:r>
-    </w:p>
-    <w:p>
-      <w:pPr>
-        <w:pStyle w:val="Quote"/>
-        <w:ind w:left="567"/>
-      </w:pPr>
-      <w:r>
-        <w:rPr>
-          <w:rFonts w:ascii="Times New Roman" w:hAnsi="Times New Roman"/>
-          <w:b w:val="0"/>
+          <w:sz w:val="18"/>
+        </w:rPr>
+        <w:t>📸  Inscription Étape 1 (Identité)</w:t>
+      </w:r>
+    </w:p>
+    <w:tbl>
+      <w:tblPr>
+        <w:tblStyle w:val="TableGrid"/>
+        <w:tblW w:type="auto" w:w="0"/>
+        <w:jc w:val="center"/>
+        <w:tblLook w:firstColumn="1" w:firstRow="1" w:lastColumn="0" w:lastRow="0" w:noHBand="0" w:noVBand="1" w:val="04A0"/>
+      </w:tblPr>
+      <w:tblGrid>
+        <w:gridCol w:w="9072"/>
+      </w:tblGrid>
+      <w:tr>
+        <w:trPr>
+          <w:trHeight w:val="3969" w:hRule="exact"/>
+        </w:trPr>
+        <w:tc>
+          <w:tcPr>
+            <w:tcW w:type="dxa" w:w="9072"/>
+            <w:shd w:val="clear" w:color="auto" w:fill="F0F0F0"/>
+          </w:tcPr>
+          <w:p>
+            <w:pPr>
+              <w:spacing w:before="1080"/>
+              <w:jc w:val="center"/>
+            </w:pPr>
+            <w:r>
+              <w:rPr>
+                <w:rFonts w:ascii="Times New Roman" w:hAnsi="Times New Roman"/>
+                <w:i/>
+                <w:color w:val="B0B0B0"/>
+                <w:sz w:val="20"/>
+              </w:rPr>
+              <w:t>[ Insérer la capture d'écran ici ]</w:t>
+            </w:r>
+          </w:p>
+        </w:tc>
+      </w:tr>
+    </w:tbl>
+    <w:p>
+      <w:pPr>
+        <w:spacing w:after="160"/>
+      </w:pPr>
+    </w:p>
+    <w:p>
+      <w:pPr>
+        <w:spacing w:before="120" w:after="40"/>
+      </w:pPr>
+      <w:r>
+        <w:rPr>
+          <w:rFonts w:ascii="Times New Roman" w:hAnsi="Times New Roman"/>
           <w:i/>
           <w:color w:val="606060"/>
-          <w:sz w:val="20"/>
-        </w:rPr>
-        <w:t>(Insérer ici la capture d'écran)</w:t>
-      </w:r>
-    </w:p>
-    <w:p>
-      <w:pPr>
-        <w:pStyle w:val="Quote"/>
-        <w:ind w:left="567"/>
-      </w:pPr>
-      <w:r>
-        <w:rPr>
-          <w:rFonts w:ascii="Times New Roman" w:hAnsi="Times New Roman"/>
-          <w:b w:val="0"/>
-          <w:i/>
-          <w:color w:val="606060"/>
-          <w:sz w:val="20"/>
-        </w:rPr>
-        <w:t>📸 CAPTURE D'ÉCRAN — Inscription Étape 4 (Téléphone + Mot de passe + jauge)</w:t>
-      </w:r>
-    </w:p>
-    <w:p>
-      <w:pPr>
-        <w:pStyle w:val="Quote"/>
-        <w:ind w:left="567"/>
-      </w:pPr>
-      <w:r>
-        <w:rPr>
-          <w:rFonts w:ascii="Times New Roman" w:hAnsi="Times New Roman"/>
-          <w:b w:val="0"/>
-          <w:i/>
-          <w:color w:val="606060"/>
-          <w:sz w:val="20"/>
-        </w:rPr>
-        <w:t>(Insérer ici la capture d'écran)</w:t>
-      </w:r>
+          <w:sz w:val="18"/>
+        </w:rPr>
+        <w:t>📸  Inscription Étape 4 (Téléphone + Mot de passe + jauge)</w:t>
+      </w:r>
+    </w:p>
+    <w:tbl>
+      <w:tblPr>
+        <w:tblStyle w:val="TableGrid"/>
+        <w:tblW w:type="auto" w:w="0"/>
+        <w:jc w:val="center"/>
+        <w:tblLook w:firstColumn="1" w:firstRow="1" w:lastColumn="0" w:lastRow="0" w:noHBand="0" w:noVBand="1" w:val="04A0"/>
+      </w:tblPr>
+      <w:tblGrid>
+        <w:gridCol w:w="9072"/>
+      </w:tblGrid>
+      <w:tr>
+        <w:trPr>
+          <w:trHeight w:val="3969" w:hRule="exact"/>
+        </w:trPr>
+        <w:tc>
+          <w:tcPr>
+            <w:tcW w:type="dxa" w:w="9072"/>
+            <w:shd w:val="clear" w:color="auto" w:fill="F0F0F0"/>
+          </w:tcPr>
+          <w:p>
+            <w:pPr>
+              <w:spacing w:before="1080"/>
+              <w:jc w:val="center"/>
+            </w:pPr>
+            <w:r>
+              <w:rPr>
+                <w:rFonts w:ascii="Times New Roman" w:hAnsi="Times New Roman"/>
+                <w:i/>
+                <w:color w:val="B0B0B0"/>
+                <w:sz w:val="20"/>
+              </w:rPr>
+              <w:t>[ Insérer la capture d'écran ici ]</w:t>
+            </w:r>
+          </w:p>
+        </w:tc>
+      </w:tr>
+    </w:tbl>
+    <w:p>
+      <w:pPr>
+        <w:spacing w:after="160"/>
+      </w:pPr>
     </w:p>
     <w:p>
       <w:pPr>
@@ -6350,35 +6630,59 @@
     </w:p>
     <w:p>
       <w:pPr>
-        <w:pStyle w:val="Quote"/>
-        <w:ind w:left="567"/>
-      </w:pPr>
-      <w:r>
-        <w:rPr>
-          <w:rFonts w:ascii="Times New Roman" w:hAnsi="Times New Roman"/>
-          <w:b w:val="0"/>
+        <w:spacing w:before="120" w:after="40"/>
+      </w:pPr>
+      <w:r>
+        <w:rPr>
+          <w:rFonts w:ascii="Times New Roman" w:hAnsi="Times New Roman"/>
           <w:i/>
           <w:color w:val="606060"/>
-          <w:sz w:val="20"/>
-        </w:rPr>
-        <w:t>📸 CAPTURE D'ÉCRAN — Dashboard Entrepreneur</w:t>
-      </w:r>
-    </w:p>
-    <w:p>
-      <w:pPr>
-        <w:pStyle w:val="Quote"/>
-        <w:ind w:left="567"/>
-      </w:pPr>
-      <w:r>
-        <w:rPr>
-          <w:rFonts w:ascii="Times New Roman" w:hAnsi="Times New Roman"/>
-          <w:b w:val="0"/>
-          <w:i/>
-          <w:color w:val="606060"/>
-          <w:sz w:val="20"/>
-        </w:rPr>
-        <w:t>(Insérer ici la capture d'écran)</w:t>
-      </w:r>
+          <w:sz w:val="18"/>
+        </w:rPr>
+        <w:t>📸  Dashboard Entrepreneur</w:t>
+      </w:r>
+    </w:p>
+    <w:tbl>
+      <w:tblPr>
+        <w:tblStyle w:val="TableGrid"/>
+        <w:tblW w:type="auto" w:w="0"/>
+        <w:jc w:val="center"/>
+        <w:tblLook w:firstColumn="1" w:firstRow="1" w:lastColumn="0" w:lastRow="0" w:noHBand="0" w:noVBand="1" w:val="04A0"/>
+      </w:tblPr>
+      <w:tblGrid>
+        <w:gridCol w:w="9072"/>
+      </w:tblGrid>
+      <w:tr>
+        <w:trPr>
+          <w:trHeight w:val="3969" w:hRule="exact"/>
+        </w:trPr>
+        <w:tc>
+          <w:tcPr>
+            <w:tcW w:type="dxa" w:w="9072"/>
+            <w:shd w:val="clear" w:color="auto" w:fill="F0F0F0"/>
+          </w:tcPr>
+          <w:p>
+            <w:pPr>
+              <w:spacing w:before="1080"/>
+              <w:jc w:val="center"/>
+            </w:pPr>
+            <w:r>
+              <w:rPr>
+                <w:rFonts w:ascii="Times New Roman" w:hAnsi="Times New Roman"/>
+                <w:i/>
+                <w:color w:val="B0B0B0"/>
+                <w:sz w:val="20"/>
+              </w:rPr>
+              <w:t>[ Insérer la capture d'écran ici ]</w:t>
+            </w:r>
+          </w:p>
+        </w:tc>
+      </w:tr>
+    </w:tbl>
+    <w:p>
+      <w:pPr>
+        <w:spacing w:after="160"/>
+      </w:pPr>
     </w:p>
     <w:p>
       <w:pPr>
@@ -6497,35 +6801,59 @@
     </w:p>
     <w:p>
       <w:pPr>
-        <w:pStyle w:val="Quote"/>
-        <w:ind w:left="567"/>
-      </w:pPr>
-      <w:r>
-        <w:rPr>
-          <w:rFonts w:ascii="Times New Roman" w:hAnsi="Times New Roman"/>
-          <w:b w:val="0"/>
+        <w:spacing w:before="120" w:after="40"/>
+      </w:pPr>
+      <w:r>
+        <w:rPr>
+          <w:rFonts w:ascii="Times New Roman" w:hAnsi="Times New Roman"/>
           <w:i/>
           <w:color w:val="606060"/>
-          <w:sz w:val="20"/>
-        </w:rPr>
-        <w:t>📸 CAPTURE D'ÉCRAN — Dashboard Mentor</w:t>
-      </w:r>
-    </w:p>
-    <w:p>
-      <w:pPr>
-        <w:pStyle w:val="Quote"/>
-        <w:ind w:left="567"/>
-      </w:pPr>
-      <w:r>
-        <w:rPr>
-          <w:rFonts w:ascii="Times New Roman" w:hAnsi="Times New Roman"/>
-          <w:b w:val="0"/>
-          <w:i/>
-          <w:color w:val="606060"/>
-          <w:sz w:val="20"/>
-        </w:rPr>
-        <w:t>(Insérer ici la capture d'écran)</w:t>
-      </w:r>
+          <w:sz w:val="18"/>
+        </w:rPr>
+        <w:t>📸  Dashboard Mentor</w:t>
+      </w:r>
+    </w:p>
+    <w:tbl>
+      <w:tblPr>
+        <w:tblStyle w:val="TableGrid"/>
+        <w:tblW w:type="auto" w:w="0"/>
+        <w:jc w:val="center"/>
+        <w:tblLook w:firstColumn="1" w:firstRow="1" w:lastColumn="0" w:lastRow="0" w:noHBand="0" w:noVBand="1" w:val="04A0"/>
+      </w:tblPr>
+      <w:tblGrid>
+        <w:gridCol w:w="9072"/>
+      </w:tblGrid>
+      <w:tr>
+        <w:trPr>
+          <w:trHeight w:val="3969" w:hRule="exact"/>
+        </w:trPr>
+        <w:tc>
+          <w:tcPr>
+            <w:tcW w:type="dxa" w:w="9072"/>
+            <w:shd w:val="clear" w:color="auto" w:fill="F0F0F0"/>
+          </w:tcPr>
+          <w:p>
+            <w:pPr>
+              <w:spacing w:before="1080"/>
+              <w:jc w:val="center"/>
+            </w:pPr>
+            <w:r>
+              <w:rPr>
+                <w:rFonts w:ascii="Times New Roman" w:hAnsi="Times New Roman"/>
+                <w:i/>
+                <w:color w:val="B0B0B0"/>
+                <w:sz w:val="20"/>
+              </w:rPr>
+              <w:t>[ Insérer la capture d'écran ici ]</w:t>
+            </w:r>
+          </w:p>
+        </w:tc>
+      </w:tr>
+    </w:tbl>
+    <w:p>
+      <w:pPr>
+        <w:spacing w:after="160"/>
+      </w:pPr>
     </w:p>
     <w:p>
       <w:pPr>
@@ -6630,35 +6958,59 @@
     </w:p>
     <w:p>
       <w:pPr>
-        <w:pStyle w:val="Quote"/>
-        <w:ind w:left="567"/>
-      </w:pPr>
-      <w:r>
-        <w:rPr>
-          <w:rFonts w:ascii="Times New Roman" w:hAnsi="Times New Roman"/>
-          <w:b w:val="0"/>
+        <w:spacing w:before="120" w:after="40"/>
+      </w:pPr>
+      <w:r>
+        <w:rPr>
+          <w:rFonts w:ascii="Times New Roman" w:hAnsi="Times New Roman"/>
           <w:i/>
           <w:color w:val="606060"/>
-          <w:sz w:val="20"/>
-        </w:rPr>
-        <w:t>📸 CAPTURE D'ÉCRAN — Dashboard Investisseur</w:t>
-      </w:r>
-    </w:p>
-    <w:p>
-      <w:pPr>
-        <w:pStyle w:val="Quote"/>
-        <w:ind w:left="567"/>
-      </w:pPr>
-      <w:r>
-        <w:rPr>
-          <w:rFonts w:ascii="Times New Roman" w:hAnsi="Times New Roman"/>
-          <w:b w:val="0"/>
-          <w:i/>
-          <w:color w:val="606060"/>
-          <w:sz w:val="20"/>
-        </w:rPr>
-        <w:t>(Insérer ici la capture d'écran)</w:t>
-      </w:r>
+          <w:sz w:val="18"/>
+        </w:rPr>
+        <w:t>📸  Dashboard Investisseur</w:t>
+      </w:r>
+    </w:p>
+    <w:tbl>
+      <w:tblPr>
+        <w:tblStyle w:val="TableGrid"/>
+        <w:tblW w:type="auto" w:w="0"/>
+        <w:jc w:val="center"/>
+        <w:tblLook w:firstColumn="1" w:firstRow="1" w:lastColumn="0" w:lastRow="0" w:noHBand="0" w:noVBand="1" w:val="04A0"/>
+      </w:tblPr>
+      <w:tblGrid>
+        <w:gridCol w:w="9072"/>
+      </w:tblGrid>
+      <w:tr>
+        <w:trPr>
+          <w:trHeight w:val="3969" w:hRule="exact"/>
+        </w:trPr>
+        <w:tc>
+          <w:tcPr>
+            <w:tcW w:type="dxa" w:w="9072"/>
+            <w:shd w:val="clear" w:color="auto" w:fill="F0F0F0"/>
+          </w:tcPr>
+          <w:p>
+            <w:pPr>
+              <w:spacing w:before="1080"/>
+              <w:jc w:val="center"/>
+            </w:pPr>
+            <w:r>
+              <w:rPr>
+                <w:rFonts w:ascii="Times New Roman" w:hAnsi="Times New Roman"/>
+                <w:i/>
+                <w:color w:val="B0B0B0"/>
+                <w:sz w:val="20"/>
+              </w:rPr>
+              <w:t>[ Insérer la capture d'écran ici ]</w:t>
+            </w:r>
+          </w:p>
+        </w:tc>
+      </w:tr>
+    </w:tbl>
+    <w:p>
+      <w:pPr>
+        <w:spacing w:after="160"/>
+      </w:pPr>
     </w:p>
     <w:p>
       <w:pPr>
@@ -6870,35 +7222,59 @@
     </w:p>
     <w:p>
       <w:pPr>
-        <w:pStyle w:val="Quote"/>
-        <w:ind w:left="567"/>
-      </w:pPr>
-      <w:r>
-        <w:rPr>
-          <w:rFonts w:ascii="Times New Roman" w:hAnsi="Times New Roman"/>
-          <w:b w:val="0"/>
+        <w:spacing w:before="120" w:after="40"/>
+      </w:pPr>
+      <w:r>
+        <w:rPr>
+          <w:rFonts w:ascii="Times New Roman" w:hAnsi="Times New Roman"/>
           <w:i/>
           <w:color w:val="606060"/>
-          <w:sz w:val="20"/>
-        </w:rPr>
-        <w:t>📸 CAPTURE D'ÉCRAN — Écran Matching (liste de profils)</w:t>
-      </w:r>
-    </w:p>
-    <w:p>
-      <w:pPr>
-        <w:pStyle w:val="Quote"/>
-        <w:ind w:left="567"/>
-      </w:pPr>
-      <w:r>
-        <w:rPr>
-          <w:rFonts w:ascii="Times New Roman" w:hAnsi="Times New Roman"/>
-          <w:b w:val="0"/>
-          <w:i/>
-          <w:color w:val="606060"/>
-          <w:sz w:val="20"/>
-        </w:rPr>
-        <w:t>(Insérer ici la capture d'écran)</w:t>
-      </w:r>
+          <w:sz w:val="18"/>
+        </w:rPr>
+        <w:t>📸  Écran Matching (liste de profils)</w:t>
+      </w:r>
+    </w:p>
+    <w:tbl>
+      <w:tblPr>
+        <w:tblStyle w:val="TableGrid"/>
+        <w:tblW w:type="auto" w:w="0"/>
+        <w:jc w:val="center"/>
+        <w:tblLook w:firstColumn="1" w:firstRow="1" w:lastColumn="0" w:lastRow="0" w:noHBand="0" w:noVBand="1" w:val="04A0"/>
+      </w:tblPr>
+      <w:tblGrid>
+        <w:gridCol w:w="9072"/>
+      </w:tblGrid>
+      <w:tr>
+        <w:trPr>
+          <w:trHeight w:val="3969" w:hRule="exact"/>
+        </w:trPr>
+        <w:tc>
+          <w:tcPr>
+            <w:tcW w:type="dxa" w:w="9072"/>
+            <w:shd w:val="clear" w:color="auto" w:fill="F0F0F0"/>
+          </w:tcPr>
+          <w:p>
+            <w:pPr>
+              <w:spacing w:before="1080"/>
+              <w:jc w:val="center"/>
+            </w:pPr>
+            <w:r>
+              <w:rPr>
+                <w:rFonts w:ascii="Times New Roman" w:hAnsi="Times New Roman"/>
+                <w:i/>
+                <w:color w:val="B0B0B0"/>
+                <w:sz w:val="20"/>
+              </w:rPr>
+              <w:t>[ Insérer la capture d'écran ici ]</w:t>
+            </w:r>
+          </w:p>
+        </w:tc>
+      </w:tr>
+    </w:tbl>
+    <w:p>
+      <w:pPr>
+        <w:spacing w:after="160"/>
+      </w:pPr>
     </w:p>
     <w:p>
       <w:pPr>
@@ -7081,35 +7457,59 @@
     </w:p>
     <w:p>
       <w:pPr>
-        <w:pStyle w:val="Quote"/>
-        <w:ind w:left="567"/>
-      </w:pPr>
-      <w:r>
-        <w:rPr>
-          <w:rFonts w:ascii="Times New Roman" w:hAnsi="Times New Roman"/>
-          <w:b w:val="0"/>
+        <w:spacing w:before="120" w:after="40"/>
+      </w:pPr>
+      <w:r>
+        <w:rPr>
+          <w:rFonts w:ascii="Times New Roman" w:hAnsi="Times New Roman"/>
           <w:i/>
           <w:color w:val="606060"/>
-          <w:sz w:val="20"/>
-        </w:rPr>
-        <w:t>📸 CAPTURE D'ÉCRAN — Écran Détail d'un Profil</w:t>
-      </w:r>
-    </w:p>
-    <w:p>
-      <w:pPr>
-        <w:pStyle w:val="Quote"/>
-        <w:ind w:left="567"/>
-      </w:pPr>
-      <w:r>
-        <w:rPr>
-          <w:rFonts w:ascii="Times New Roman" w:hAnsi="Times New Roman"/>
-          <w:b w:val="0"/>
-          <w:i/>
-          <w:color w:val="606060"/>
-          <w:sz w:val="20"/>
-        </w:rPr>
-        <w:t>(Insérer ici la capture d'écran)</w:t>
-      </w:r>
+          <w:sz w:val="18"/>
+        </w:rPr>
+        <w:t>📸  Écran Détail d'un Profil</w:t>
+      </w:r>
+    </w:p>
+    <w:tbl>
+      <w:tblPr>
+        <w:tblStyle w:val="TableGrid"/>
+        <w:tblW w:type="auto" w:w="0"/>
+        <w:jc w:val="center"/>
+        <w:tblLook w:firstColumn="1" w:firstRow="1" w:lastColumn="0" w:lastRow="0" w:noHBand="0" w:noVBand="1" w:val="04A0"/>
+      </w:tblPr>
+      <w:tblGrid>
+        <w:gridCol w:w="9072"/>
+      </w:tblGrid>
+      <w:tr>
+        <w:trPr>
+          <w:trHeight w:val="3969" w:hRule="exact"/>
+        </w:trPr>
+        <w:tc>
+          <w:tcPr>
+            <w:tcW w:type="dxa" w:w="9072"/>
+            <w:shd w:val="clear" w:color="auto" w:fill="F0F0F0"/>
+          </w:tcPr>
+          <w:p>
+            <w:pPr>
+              <w:spacing w:before="1080"/>
+              <w:jc w:val="center"/>
+            </w:pPr>
+            <w:r>
+              <w:rPr>
+                <w:rFonts w:ascii="Times New Roman" w:hAnsi="Times New Roman"/>
+                <w:i/>
+                <w:color w:val="B0B0B0"/>
+                <w:sz w:val="20"/>
+              </w:rPr>
+              <w:t>[ Insérer la capture d'écran ici ]</w:t>
+            </w:r>
+          </w:p>
+        </w:tc>
+      </w:tr>
+    </w:tbl>
+    <w:p>
+      <w:pPr>
+        <w:spacing w:after="160"/>
+      </w:pPr>
     </w:p>
     <w:p>
       <w:pPr>
@@ -7366,35 +7766,59 @@
     </w:p>
     <w:p>
       <w:pPr>
-        <w:pStyle w:val="Quote"/>
-        <w:ind w:left="567"/>
-      </w:pPr>
-      <w:r>
-        <w:rPr>
-          <w:rFonts w:ascii="Times New Roman" w:hAnsi="Times New Roman"/>
-          <w:b w:val="0"/>
+        <w:spacing w:before="120" w:after="40"/>
+      </w:pPr>
+      <w:r>
+        <w:rPr>
+          <w:rFonts w:ascii="Times New Roman" w:hAnsi="Times New Roman"/>
           <w:i/>
           <w:color w:val="606060"/>
-          <w:sz w:val="20"/>
-        </w:rPr>
-        <w:t>📸 CAPTURE D'ÉCRAN — Écran Liste des Messages</w:t>
-      </w:r>
-    </w:p>
-    <w:p>
-      <w:pPr>
-        <w:pStyle w:val="Quote"/>
-        <w:ind w:left="567"/>
-      </w:pPr>
-      <w:r>
-        <w:rPr>
-          <w:rFonts w:ascii="Times New Roman" w:hAnsi="Times New Roman"/>
-          <w:b w:val="0"/>
-          <w:i/>
-          <w:color w:val="606060"/>
-          <w:sz w:val="20"/>
-        </w:rPr>
-        <w:t>(Insérer ici la capture d'écran)</w:t>
-      </w:r>
+          <w:sz w:val="18"/>
+        </w:rPr>
+        <w:t>📸  Écran Liste des Messages</w:t>
+      </w:r>
+    </w:p>
+    <w:tbl>
+      <w:tblPr>
+        <w:tblStyle w:val="TableGrid"/>
+        <w:tblW w:type="auto" w:w="0"/>
+        <w:jc w:val="center"/>
+        <w:tblLook w:firstColumn="1" w:firstRow="1" w:lastColumn="0" w:lastRow="0" w:noHBand="0" w:noVBand="1" w:val="04A0"/>
+      </w:tblPr>
+      <w:tblGrid>
+        <w:gridCol w:w="9072"/>
+      </w:tblGrid>
+      <w:tr>
+        <w:trPr>
+          <w:trHeight w:val="3969" w:hRule="exact"/>
+        </w:trPr>
+        <w:tc>
+          <w:tcPr>
+            <w:tcW w:type="dxa" w:w="9072"/>
+            <w:shd w:val="clear" w:color="auto" w:fill="F0F0F0"/>
+          </w:tcPr>
+          <w:p>
+            <w:pPr>
+              <w:spacing w:before="1080"/>
+              <w:jc w:val="center"/>
+            </w:pPr>
+            <w:r>
+              <w:rPr>
+                <w:rFonts w:ascii="Times New Roman" w:hAnsi="Times New Roman"/>
+                <w:i/>
+                <w:color w:val="B0B0B0"/>
+                <w:sz w:val="20"/>
+              </w:rPr>
+              <w:t>[ Insérer la capture d'écran ici ]</w:t>
+            </w:r>
+          </w:p>
+        </w:tc>
+      </w:tr>
+    </w:tbl>
+    <w:p>
+      <w:pPr>
+        <w:spacing w:after="160"/>
+      </w:pPr>
     </w:p>
     <w:p>
       <w:pPr>
@@ -7631,35 +8055,59 @@
     </w:p>
     <w:p>
       <w:pPr>
-        <w:pStyle w:val="Quote"/>
-        <w:ind w:left="567"/>
-      </w:pPr>
-      <w:r>
-        <w:rPr>
-          <w:rFonts w:ascii="Times New Roman" w:hAnsi="Times New Roman"/>
-          <w:b w:val="0"/>
+        <w:spacing w:before="120" w:after="40"/>
+      </w:pPr>
+      <w:r>
+        <w:rPr>
+          <w:rFonts w:ascii="Times New Roman" w:hAnsi="Times New Roman"/>
           <w:i/>
           <w:color w:val="606060"/>
-          <w:sz w:val="20"/>
-        </w:rPr>
-        <w:t>📸 CAPTURE D'ÉCRAN — Centre de Notifications</w:t>
-      </w:r>
-    </w:p>
-    <w:p>
-      <w:pPr>
-        <w:pStyle w:val="Quote"/>
-        <w:ind w:left="567"/>
-      </w:pPr>
-      <w:r>
-        <w:rPr>
-          <w:rFonts w:ascii="Times New Roman" w:hAnsi="Times New Roman"/>
-          <w:b w:val="0"/>
-          <w:i/>
-          <w:color w:val="606060"/>
-          <w:sz w:val="20"/>
-        </w:rPr>
-        <w:t>(Insérer ici la capture d'écran)</w:t>
-      </w:r>
+          <w:sz w:val="18"/>
+        </w:rPr>
+        <w:t>📸  Centre de Notifications</w:t>
+      </w:r>
+    </w:p>
+    <w:tbl>
+      <w:tblPr>
+        <w:tblStyle w:val="TableGrid"/>
+        <w:tblW w:type="auto" w:w="0"/>
+        <w:jc w:val="center"/>
+        <w:tblLook w:firstColumn="1" w:firstRow="1" w:lastColumn="0" w:lastRow="0" w:noHBand="0" w:noVBand="1" w:val="04A0"/>
+      </w:tblPr>
+      <w:tblGrid>
+        <w:gridCol w:w="9072"/>
+      </w:tblGrid>
+      <w:tr>
+        <w:trPr>
+          <w:trHeight w:val="3969" w:hRule="exact"/>
+        </w:trPr>
+        <w:tc>
+          <w:tcPr>
+            <w:tcW w:type="dxa" w:w="9072"/>
+            <w:shd w:val="clear" w:color="auto" w:fill="F0F0F0"/>
+          </w:tcPr>
+          <w:p>
+            <w:pPr>
+              <w:spacing w:before="1080"/>
+              <w:jc w:val="center"/>
+            </w:pPr>
+            <w:r>
+              <w:rPr>
+                <w:rFonts w:ascii="Times New Roman" w:hAnsi="Times New Roman"/>
+                <w:i/>
+                <w:color w:val="B0B0B0"/>
+                <w:sz w:val="20"/>
+              </w:rPr>
+              <w:t>[ Insérer la capture d'écran ici ]</w:t>
+            </w:r>
+          </w:p>
+        </w:tc>
+      </w:tr>
+    </w:tbl>
+    <w:p>
+      <w:pPr>
+        <w:spacing w:after="160"/>
+      </w:pPr>
     </w:p>
     <w:p>
       <w:pPr>
@@ -7852,35 +8300,59 @@
     </w:p>
     <w:p>
       <w:pPr>
-        <w:pStyle w:val="Quote"/>
-        <w:ind w:left="567"/>
-      </w:pPr>
-      <w:r>
-        <w:rPr>
-          <w:rFonts w:ascii="Times New Roman" w:hAnsi="Times New Roman"/>
-          <w:b w:val="0"/>
+        <w:spacing w:before="120" w:after="40"/>
+      </w:pPr>
+      <w:r>
+        <w:rPr>
+          <w:rFonts w:ascii="Times New Roman" w:hAnsi="Times New Roman"/>
           <w:i/>
           <w:color w:val="606060"/>
-          <w:sz w:val="20"/>
-        </w:rPr>
-        <w:t>📸 CAPTURE D'ÉCRAN — Mon Profil</w:t>
-      </w:r>
-    </w:p>
-    <w:p>
-      <w:pPr>
-        <w:pStyle w:val="Quote"/>
-        <w:ind w:left="567"/>
-      </w:pPr>
-      <w:r>
-        <w:rPr>
-          <w:rFonts w:ascii="Times New Roman" w:hAnsi="Times New Roman"/>
-          <w:b w:val="0"/>
-          <w:i/>
-          <w:color w:val="606060"/>
-          <w:sz w:val="20"/>
-        </w:rPr>
-        <w:t>(Insérer ici la capture d'écran)</w:t>
-      </w:r>
+          <w:sz w:val="18"/>
+        </w:rPr>
+        <w:t>📸  Mon Profil</w:t>
+      </w:r>
+    </w:p>
+    <w:tbl>
+      <w:tblPr>
+        <w:tblStyle w:val="TableGrid"/>
+        <w:tblW w:type="auto" w:w="0"/>
+        <w:jc w:val="center"/>
+        <w:tblLook w:firstColumn="1" w:firstRow="1" w:lastColumn="0" w:lastRow="0" w:noHBand="0" w:noVBand="1" w:val="04A0"/>
+      </w:tblPr>
+      <w:tblGrid>
+        <w:gridCol w:w="9072"/>
+      </w:tblGrid>
+      <w:tr>
+        <w:trPr>
+          <w:trHeight w:val="3969" w:hRule="exact"/>
+        </w:trPr>
+        <w:tc>
+          <w:tcPr>
+            <w:tcW w:type="dxa" w:w="9072"/>
+            <w:shd w:val="clear" w:color="auto" w:fill="F0F0F0"/>
+          </w:tcPr>
+          <w:p>
+            <w:pPr>
+              <w:spacing w:before="1080"/>
+              <w:jc w:val="center"/>
+            </w:pPr>
+            <w:r>
+              <w:rPr>
+                <w:rFonts w:ascii="Times New Roman" w:hAnsi="Times New Roman"/>
+                <w:i/>
+                <w:color w:val="B0B0B0"/>
+                <w:sz w:val="20"/>
+              </w:rPr>
+              <w:t>[ Insérer la capture d'écran ici ]</w:t>
+            </w:r>
+          </w:p>
+        </w:tc>
+      </w:tr>
+    </w:tbl>
+    <w:p>
+      <w:pPr>
+        <w:spacing w:after="160"/>
+      </w:pPr>
     </w:p>
     <w:p>
       <w:pPr>
@@ -8055,35 +8527,59 @@
     </w:p>
     <w:p>
       <w:pPr>
-        <w:pStyle w:val="Quote"/>
-        <w:ind w:left="567"/>
-      </w:pPr>
-      <w:r>
-        <w:rPr>
-          <w:rFonts w:ascii="Times New Roman" w:hAnsi="Times New Roman"/>
-          <w:b w:val="0"/>
+        <w:spacing w:before="120" w:after="40"/>
+      </w:pPr>
+      <w:r>
+        <w:rPr>
+          <w:rFonts w:ascii="Times New Roman" w:hAnsi="Times New Roman"/>
           <w:i/>
           <w:color w:val="606060"/>
-          <w:sz w:val="20"/>
-        </w:rPr>
-        <w:t>📸 CAPTURE D'ÉCRAN — Écran Modifier le Profil</w:t>
-      </w:r>
-    </w:p>
-    <w:p>
-      <w:pPr>
-        <w:pStyle w:val="Quote"/>
-        <w:ind w:left="567"/>
-      </w:pPr>
-      <w:r>
-        <w:rPr>
-          <w:rFonts w:ascii="Times New Roman" w:hAnsi="Times New Roman"/>
-          <w:b w:val="0"/>
-          <w:i/>
-          <w:color w:val="606060"/>
-          <w:sz w:val="20"/>
-        </w:rPr>
-        <w:t>(Insérer ici la capture d'écran)</w:t>
-      </w:r>
+          <w:sz w:val="18"/>
+        </w:rPr>
+        <w:t>📸  Écran Modifier le Profil</w:t>
+      </w:r>
+    </w:p>
+    <w:tbl>
+      <w:tblPr>
+        <w:tblStyle w:val="TableGrid"/>
+        <w:tblW w:type="auto" w:w="0"/>
+        <w:jc w:val="center"/>
+        <w:tblLook w:firstColumn="1" w:firstRow="1" w:lastColumn="0" w:lastRow="0" w:noHBand="0" w:noVBand="1" w:val="04A0"/>
+      </w:tblPr>
+      <w:tblGrid>
+        <w:gridCol w:w="9072"/>
+      </w:tblGrid>
+      <w:tr>
+        <w:trPr>
+          <w:trHeight w:val="3969" w:hRule="exact"/>
+        </w:trPr>
+        <w:tc>
+          <w:tcPr>
+            <w:tcW w:type="dxa" w:w="9072"/>
+            <w:shd w:val="clear" w:color="auto" w:fill="F0F0F0"/>
+          </w:tcPr>
+          <w:p>
+            <w:pPr>
+              <w:spacing w:before="1080"/>
+              <w:jc w:val="center"/>
+            </w:pPr>
+            <w:r>
+              <w:rPr>
+                <w:rFonts w:ascii="Times New Roman" w:hAnsi="Times New Roman"/>
+                <w:i/>
+                <w:color w:val="B0B0B0"/>
+                <w:sz w:val="20"/>
+              </w:rPr>
+              <w:t>[ Insérer la capture d'écran ici ]</w:t>
+            </w:r>
+          </w:p>
+        </w:tc>
+      </w:tr>
+    </w:tbl>
+    <w:p>
+      <w:pPr>
+        <w:spacing w:after="160"/>
+      </w:pPr>
     </w:p>
     <w:p>
       <w:pPr>
@@ -8266,35 +8762,59 @@
     </w:p>
     <w:p>
       <w:pPr>
-        <w:pStyle w:val="Quote"/>
-        <w:ind w:left="567"/>
-      </w:pPr>
-      <w:r>
-        <w:rPr>
-          <w:rFonts w:ascii="Times New Roman" w:hAnsi="Times New Roman"/>
-          <w:b w:val="0"/>
+        <w:spacing w:before="120" w:after="40"/>
+      </w:pPr>
+      <w:r>
+        <w:rPr>
+          <w:rFonts w:ascii="Times New Roman" w:hAnsi="Times New Roman"/>
           <w:i/>
           <w:color w:val="606060"/>
-          <w:sz w:val="20"/>
-        </w:rPr>
-        <w:t>📸 CAPTURE D'ÉCRAN — Déposer un Pitch (Étape 1)</w:t>
-      </w:r>
-    </w:p>
-    <w:p>
-      <w:pPr>
-        <w:pStyle w:val="Quote"/>
-        <w:ind w:left="567"/>
-      </w:pPr>
-      <w:r>
-        <w:rPr>
-          <w:rFonts w:ascii="Times New Roman" w:hAnsi="Times New Roman"/>
-          <w:b w:val="0"/>
-          <w:i/>
-          <w:color w:val="606060"/>
-          <w:sz w:val="20"/>
-        </w:rPr>
-        <w:t>(Insérer ici la capture d'écran)</w:t>
-      </w:r>
+          <w:sz w:val="18"/>
+        </w:rPr>
+        <w:t>📸  Déposer un Pitch (Étape 1)</w:t>
+      </w:r>
+    </w:p>
+    <w:tbl>
+      <w:tblPr>
+        <w:tblStyle w:val="TableGrid"/>
+        <w:tblW w:type="auto" w:w="0"/>
+        <w:jc w:val="center"/>
+        <w:tblLook w:firstColumn="1" w:firstRow="1" w:lastColumn="0" w:lastRow="0" w:noHBand="0" w:noVBand="1" w:val="04A0"/>
+      </w:tblPr>
+      <w:tblGrid>
+        <w:gridCol w:w="9072"/>
+      </w:tblGrid>
+      <w:tr>
+        <w:trPr>
+          <w:trHeight w:val="3969" w:hRule="exact"/>
+        </w:trPr>
+        <w:tc>
+          <w:tcPr>
+            <w:tcW w:type="dxa" w:w="9072"/>
+            <w:shd w:val="clear" w:color="auto" w:fill="F0F0F0"/>
+          </w:tcPr>
+          <w:p>
+            <w:pPr>
+              <w:spacing w:before="1080"/>
+              <w:jc w:val="center"/>
+            </w:pPr>
+            <w:r>
+              <w:rPr>
+                <w:rFonts w:ascii="Times New Roman" w:hAnsi="Times New Roman"/>
+                <w:i/>
+                <w:color w:val="B0B0B0"/>
+                <w:sz w:val="20"/>
+              </w:rPr>
+              <w:t>[ Insérer la capture d'écran ici ]</w:t>
+            </w:r>
+          </w:p>
+        </w:tc>
+      </w:tr>
+    </w:tbl>
+    <w:p>
+      <w:pPr>
+        <w:spacing w:after="160"/>
+      </w:pPr>
     </w:p>
     <w:p>
       <w:pPr>
@@ -8413,35 +8933,59 @@
     </w:p>
     <w:p>
       <w:pPr>
-        <w:pStyle w:val="Quote"/>
-        <w:ind w:left="567"/>
-      </w:pPr>
-      <w:r>
-        <w:rPr>
-          <w:rFonts w:ascii="Times New Roman" w:hAnsi="Times New Roman"/>
-          <w:b w:val="0"/>
+        <w:spacing w:before="120" w:after="40"/>
+      </w:pPr>
+      <w:r>
+        <w:rPr>
+          <w:rFonts w:ascii="Times New Roman" w:hAnsi="Times New Roman"/>
           <w:i/>
           <w:color w:val="606060"/>
-          <w:sz w:val="20"/>
-        </w:rPr>
-        <w:t>📸 CAPTURE D'ÉCRAN — Liste des Pitchs Publiés</w:t>
-      </w:r>
-    </w:p>
-    <w:p>
-      <w:pPr>
-        <w:pStyle w:val="Quote"/>
-        <w:ind w:left="567"/>
-      </w:pPr>
-      <w:r>
-        <w:rPr>
-          <w:rFonts w:ascii="Times New Roman" w:hAnsi="Times New Roman"/>
-          <w:b w:val="0"/>
-          <w:i/>
-          <w:color w:val="606060"/>
-          <w:sz w:val="20"/>
-        </w:rPr>
-        <w:t>(Insérer ici la capture d'écran)</w:t>
-      </w:r>
+          <w:sz w:val="18"/>
+        </w:rPr>
+        <w:t>📸  Liste des Pitchs Publiés</w:t>
+      </w:r>
+    </w:p>
+    <w:tbl>
+      <w:tblPr>
+        <w:tblStyle w:val="TableGrid"/>
+        <w:tblW w:type="auto" w:w="0"/>
+        <w:jc w:val="center"/>
+        <w:tblLook w:firstColumn="1" w:firstRow="1" w:lastColumn="0" w:lastRow="0" w:noHBand="0" w:noVBand="1" w:val="04A0"/>
+      </w:tblPr>
+      <w:tblGrid>
+        <w:gridCol w:w="9072"/>
+      </w:tblGrid>
+      <w:tr>
+        <w:trPr>
+          <w:trHeight w:val="3969" w:hRule="exact"/>
+        </w:trPr>
+        <w:tc>
+          <w:tcPr>
+            <w:tcW w:type="dxa" w:w="9072"/>
+            <w:shd w:val="clear" w:color="auto" w:fill="F0F0F0"/>
+          </w:tcPr>
+          <w:p>
+            <w:pPr>
+              <w:spacing w:before="1080"/>
+              <w:jc w:val="center"/>
+            </w:pPr>
+            <w:r>
+              <w:rPr>
+                <w:rFonts w:ascii="Times New Roman" w:hAnsi="Times New Roman"/>
+                <w:i/>
+                <w:color w:val="B0B0B0"/>
+                <w:sz w:val="20"/>
+              </w:rPr>
+              <w:t>[ Insérer la capture d'écran ici ]</w:t>
+            </w:r>
+          </w:p>
+        </w:tc>
+      </w:tr>
+    </w:tbl>
+    <w:p>
+      <w:pPr>
+        <w:spacing w:after="160"/>
+      </w:pPr>
     </w:p>
     <w:p>
       <w:pPr>
@@ -8821,35 +9365,59 @@
     </w:p>
     <w:p>
       <w:pPr>
-        <w:pStyle w:val="Quote"/>
-        <w:ind w:left="567"/>
-      </w:pPr>
-      <w:r>
-        <w:rPr>
-          <w:rFonts w:ascii="Times New Roman" w:hAnsi="Times New Roman"/>
-          <w:b w:val="0"/>
+        <w:spacing w:before="120" w:after="40"/>
+      </w:pPr>
+      <w:r>
+        <w:rPr>
+          <w:rFonts w:ascii="Times New Roman" w:hAnsi="Times New Roman"/>
           <w:i/>
           <w:color w:val="606060"/>
-          <w:sz w:val="20"/>
-        </w:rPr>
-        <w:t>📸 CAPTURE D'ÉCRAN — Chatbot DIALI IA</w:t>
-      </w:r>
-    </w:p>
-    <w:p>
-      <w:pPr>
-        <w:pStyle w:val="Quote"/>
-        <w:ind w:left="567"/>
-      </w:pPr>
-      <w:r>
-        <w:rPr>
-          <w:rFonts w:ascii="Times New Roman" w:hAnsi="Times New Roman"/>
-          <w:b w:val="0"/>
-          <w:i/>
-          <w:color w:val="606060"/>
-          <w:sz w:val="20"/>
-        </w:rPr>
-        <w:t>(Insérer ici la capture d'écran)</w:t>
-      </w:r>
+          <w:sz w:val="18"/>
+        </w:rPr>
+        <w:t>📸  Chatbot DIALI IA</w:t>
+      </w:r>
+    </w:p>
+    <w:tbl>
+      <w:tblPr>
+        <w:tblStyle w:val="TableGrid"/>
+        <w:tblW w:type="auto" w:w="0"/>
+        <w:jc w:val="center"/>
+        <w:tblLook w:firstColumn="1" w:firstRow="1" w:lastColumn="0" w:lastRow="0" w:noHBand="0" w:noVBand="1" w:val="04A0"/>
+      </w:tblPr>
+      <w:tblGrid>
+        <w:gridCol w:w="9072"/>
+      </w:tblGrid>
+      <w:tr>
+        <w:trPr>
+          <w:trHeight w:val="3969" w:hRule="exact"/>
+        </w:trPr>
+        <w:tc>
+          <w:tcPr>
+            <w:tcW w:type="dxa" w:w="9072"/>
+            <w:shd w:val="clear" w:color="auto" w:fill="F0F0F0"/>
+          </w:tcPr>
+          <w:p>
+            <w:pPr>
+              <w:spacing w:before="1080"/>
+              <w:jc w:val="center"/>
+            </w:pPr>
+            <w:r>
+              <w:rPr>
+                <w:rFonts w:ascii="Times New Roman" w:hAnsi="Times New Roman"/>
+                <w:i/>
+                <w:color w:val="B0B0B0"/>
+                <w:sz w:val="20"/>
+              </w:rPr>
+              <w:t>[ Insérer la capture d'écran ici ]</w:t>
+            </w:r>
+          </w:p>
+        </w:tc>
+      </w:tr>
+    </w:tbl>
+    <w:p>
+      <w:pPr>
+        <w:spacing w:after="160"/>
+      </w:pPr>
     </w:p>
     <w:p>
       <w:pPr>
@@ -11409,67 +11977,115 @@
     </w:p>
     <w:p>
       <w:pPr>
-        <w:pStyle w:val="Quote"/>
-        <w:ind w:left="567"/>
-      </w:pPr>
-      <w:r>
-        <w:rPr>
-          <w:rFonts w:ascii="Times New Roman" w:hAnsi="Times New Roman"/>
-          <w:b w:val="0"/>
+        <w:spacing w:before="120" w:after="40"/>
+      </w:pPr>
+      <w:r>
+        <w:rPr>
+          <w:rFonts w:ascii="Times New Roman" w:hAnsi="Times New Roman"/>
           <w:i/>
           <w:color w:val="606060"/>
-          <w:sz w:val="20"/>
-        </w:rPr>
-        <w:t>📸 CAPTURE D'ÉCRAN — Barre de navigation 5 onglets avec badge Messages</w:t>
-      </w:r>
-    </w:p>
-    <w:p>
-      <w:pPr>
-        <w:pStyle w:val="Quote"/>
-        <w:ind w:left="567"/>
-      </w:pPr>
-      <w:r>
-        <w:rPr>
-          <w:rFonts w:ascii="Times New Roman" w:hAnsi="Times New Roman"/>
-          <w:b w:val="0"/>
+          <w:sz w:val="18"/>
+        </w:rPr>
+        <w:t>📸  Barre de navigation 5 onglets avec badge Messages</w:t>
+      </w:r>
+    </w:p>
+    <w:tbl>
+      <w:tblPr>
+        <w:tblStyle w:val="TableGrid"/>
+        <w:tblW w:type="auto" w:w="0"/>
+        <w:jc w:val="center"/>
+        <w:tblLook w:firstColumn="1" w:firstRow="1" w:lastColumn="0" w:lastRow="0" w:noHBand="0" w:noVBand="1" w:val="04A0"/>
+      </w:tblPr>
+      <w:tblGrid>
+        <w:gridCol w:w="9072"/>
+      </w:tblGrid>
+      <w:tr>
+        <w:trPr>
+          <w:trHeight w:val="3969" w:hRule="exact"/>
+        </w:trPr>
+        <w:tc>
+          <w:tcPr>
+            <w:tcW w:type="dxa" w:w="9072"/>
+            <w:shd w:val="clear" w:color="auto" w:fill="F0F0F0"/>
+          </w:tcPr>
+          <w:p>
+            <w:pPr>
+              <w:spacing w:before="1080"/>
+              <w:jc w:val="center"/>
+            </w:pPr>
+            <w:r>
+              <w:rPr>
+                <w:rFonts w:ascii="Times New Roman" w:hAnsi="Times New Roman"/>
+                <w:i/>
+                <w:color w:val="B0B0B0"/>
+                <w:sz w:val="20"/>
+              </w:rPr>
+              <w:t>[ Insérer la capture d'écran ici ]</w:t>
+            </w:r>
+          </w:p>
+        </w:tc>
+      </w:tr>
+    </w:tbl>
+    <w:p>
+      <w:pPr>
+        <w:spacing w:after="160"/>
+      </w:pPr>
+    </w:p>
+    <w:p>
+      <w:pPr>
+        <w:spacing w:before="120" w:after="40"/>
+      </w:pPr>
+      <w:r>
+        <w:rPr>
+          <w:rFonts w:ascii="Times New Roman" w:hAnsi="Times New Roman"/>
           <w:i/>
           <w:color w:val="606060"/>
-          <w:sz w:val="20"/>
-        </w:rPr>
-        <w:t>(Insérer ici la capture d'écran)</w:t>
-      </w:r>
-    </w:p>
-    <w:p>
-      <w:pPr>
-        <w:pStyle w:val="Quote"/>
-        <w:ind w:left="567"/>
-      </w:pPr>
-      <w:r>
-        <w:rPr>
-          <w:rFonts w:ascii="Times New Roman" w:hAnsi="Times New Roman"/>
-          <w:b w:val="0"/>
-          <w:i/>
-          <w:color w:val="606060"/>
-          <w:sz w:val="20"/>
-        </w:rPr>
-        <w:t>📸 CAPTURE D'ÉCRAN — FAB chatbot DIALI (bouton doré pulsant)</w:t>
-      </w:r>
-    </w:p>
-    <w:p>
-      <w:pPr>
-        <w:pStyle w:val="Quote"/>
-        <w:ind w:left="567"/>
-      </w:pPr>
-      <w:r>
-        <w:rPr>
-          <w:rFonts w:ascii="Times New Roman" w:hAnsi="Times New Roman"/>
-          <w:b w:val="0"/>
-          <w:i/>
-          <w:color w:val="606060"/>
-          <w:sz w:val="20"/>
-        </w:rPr>
-        <w:t>(Insérer ici la capture d'écran)</w:t>
-      </w:r>
+          <w:sz w:val="18"/>
+        </w:rPr>
+        <w:t>📸  FAB chatbot DIALI (bouton doré pulsant)</w:t>
+      </w:r>
+    </w:p>
+    <w:tbl>
+      <w:tblPr>
+        <w:tblStyle w:val="TableGrid"/>
+        <w:tblW w:type="auto" w:w="0"/>
+        <w:jc w:val="center"/>
+        <w:tblLook w:firstColumn="1" w:firstRow="1" w:lastColumn="0" w:lastRow="0" w:noHBand="0" w:noVBand="1" w:val="04A0"/>
+      </w:tblPr>
+      <w:tblGrid>
+        <w:gridCol w:w="9072"/>
+      </w:tblGrid>
+      <w:tr>
+        <w:trPr>
+          <w:trHeight w:val="3969" w:hRule="exact"/>
+        </w:trPr>
+        <w:tc>
+          <w:tcPr>
+            <w:tcW w:type="dxa" w:w="9072"/>
+            <w:shd w:val="clear" w:color="auto" w:fill="F0F0F0"/>
+          </w:tcPr>
+          <w:p>
+            <w:pPr>
+              <w:spacing w:before="1080"/>
+              <w:jc w:val="center"/>
+            </w:pPr>
+            <w:r>
+              <w:rPr>
+                <w:rFonts w:ascii="Times New Roman" w:hAnsi="Times New Roman"/>
+                <w:i/>
+                <w:color w:val="B0B0B0"/>
+                <w:sz w:val="20"/>
+              </w:rPr>
+              <w:t>[ Insérer la capture d'écran ici ]</w:t>
+            </w:r>
+          </w:p>
+        </w:tc>
+      </w:tr>
+    </w:tbl>
+    <w:p>
+      <w:pPr>
+        <w:spacing w:after="160"/>
+      </w:pPr>
     </w:p>
     <w:p>
       <w:pPr>

</xml_diff>

<commit_message>
docs: livrables corriges et DOCX regeneres (audit coherence complet)
</commit_message>
<xml_diff>
--- a/livrables/docx/DIAPALER_AFRICA_Livrable1.docx
+++ b/livrables/docx/DIAPALER_AFRICA_Livrable1.docx
@@ -2229,6 +2229,18 @@
             <w:pPr>
               <w:spacing w:before="0" w:after="0"/>
             </w:pPr>
+            <w:r>
+              <w:rPr>
+                <w:rFonts w:ascii="Courier New" w:hAnsi="Courier New"/>
+                <w:sz w:val="17"/>
+              </w:rPr>
+              <w:t>publish_to: 'none'</w:t>
+            </w:r>
+          </w:p>
+          <w:p>
+            <w:pPr>
+              <w:spacing w:before="0" w:after="0"/>
+            </w:pPr>
           </w:p>
           <w:p>
             <w:pPr>
@@ -2704,7 +2716,7 @@
                 <w:rFonts w:ascii="Courier New" w:hAnsi="Courier New"/>
                 <w:sz w:val="17"/>
               </w:rPr>
-              <w:t>│   │   ├── donnees_mentors.dart         # 100+ profils sénégalais (statiques)</w:t>
+              <w:t>│   │   ├── donnees_mentors.dart         # 112 profils sénégalais (statiques)</w:t>
             </w:r>
           </w:p>
           <w:p>
@@ -3306,6 +3318,42 @@
                 <w:rFonts w:ascii="Courier New" w:hAnsi="Courier New"/>
                 <w:sz w:val="17"/>
               </w:rPr>
+              <w:t xml:space="preserve">    // Note : le code réel enveloppe MaterialApp dans un CursorFollower (effet</w:t>
+            </w:r>
+          </w:p>
+          <w:p>
+            <w:pPr>
+              <w:spacing w:before="0" w:after="0"/>
+            </w:pPr>
+            <w:r>
+              <w:rPr>
+                <w:rFonts w:ascii="Courier New" w:hAnsi="Courier New"/>
+                <w:sz w:val="17"/>
+              </w:rPr>
+              <w:t xml:space="preserve">    // curseur personnalisé web) et configure également un pageTransitionsTheme</w:t>
+            </w:r>
+          </w:p>
+          <w:p>
+            <w:pPr>
+              <w:spacing w:before="0" w:after="0"/>
+            </w:pPr>
+            <w:r>
+              <w:rPr>
+                <w:rFonts w:ascii="Courier New" w:hAnsi="Courier New"/>
+                <w:sz w:val="17"/>
+              </w:rPr>
+              <w:t xml:space="preserve">    // global (_FadeThroughBuilder) dans AppTheme.light() / dark().</w:t>
+            </w:r>
+          </w:p>
+          <w:p>
+            <w:pPr>
+              <w:spacing w:before="0" w:after="0"/>
+            </w:pPr>
+            <w:r>
+              <w:rPr>
+                <w:rFonts w:ascii="Courier New" w:hAnsi="Courier New"/>
+                <w:sz w:val="17"/>
+              </w:rPr>
               <w:t xml:space="preserve">    return MaterialApp(</w:t>
             </w:r>
           </w:p>
@@ -4133,7 +4181,7 @@
                 <w:rFonts w:ascii="Courier New" w:hAnsi="Courier New"/>
                 <w:sz w:val="17"/>
               </w:rPr>
-              <w:t xml:space="preserve">  static const navyDeep  = Color(0xFF0F1C4D); // Textes, titres principaux</w:t>
+              <w:t xml:space="preserve">  static const navyDeep   = Color(0xFF0F1729); // Textes, titres principaux</w:t>
             </w:r>
           </w:p>
           <w:p>
@@ -4145,7 +4193,7 @@
                 <w:rFonts w:ascii="Courier New" w:hAnsi="Courier New"/>
                 <w:sz w:val="17"/>
               </w:rPr>
-              <w:t xml:space="preserve">  static const navy      = Color(0xFF1B2B6B); // Fonds navbars, boutons</w:t>
+              <w:t xml:space="preserve">  static const navy       = Color(0xFF0A234B); // Fonds navbars, boutons</w:t>
             </w:r>
           </w:p>
           <w:p>
@@ -4157,7 +4205,7 @@
                 <w:rFonts w:ascii="Courier New" w:hAnsi="Courier New"/>
                 <w:sz w:val="17"/>
               </w:rPr>
-              <w:t xml:space="preserve">  static const blue      = Color(0xFF2563EB); // Investisseurs, liens actifs</w:t>
+              <w:t xml:space="preserve">  static const blue       = Color(0xFF1E50A0); // Investisseurs, liens actifs</w:t>
             </w:r>
           </w:p>
           <w:p>
@@ -4169,7 +4217,7 @@
                 <w:rFonts w:ascii="Courier New" w:hAnsi="Courier New"/>
                 <w:sz w:val="17"/>
               </w:rPr>
-              <w:t xml:space="preserve">  static const amber     = Color(0xFFF5A623); // Or sénégalais — CTAs, FAB</w:t>
+              <w:t xml:space="preserve">  static const blueBright = Color(0xFF3B82F6); // Bleu vif (liens, accents)</w:t>
             </w:r>
           </w:p>
           <w:p>
@@ -4181,13 +4229,8 @@
                 <w:rFonts w:ascii="Courier New" w:hAnsi="Courier New"/>
                 <w:sz w:val="17"/>
               </w:rPr>
-              <w:t xml:space="preserve">  static const amberSoft = Color(0xFFFFF3DC); // Fond chips amber</w:t>
-            </w:r>
-          </w:p>
-          <w:p>
-            <w:pPr>
-              <w:spacing w:before="0" w:after="0"/>
-            </w:pPr>
+              <w:t xml:space="preserve">  static const blueTint   = Color(0xFFDCE6F5); // Fond chips par défaut</w:t>
+            </w:r>
           </w:p>
           <w:p>
             <w:pPr>
@@ -4198,7 +4241,7 @@
                 <w:rFonts w:ascii="Courier New" w:hAnsi="Courier New"/>
                 <w:sz w:val="17"/>
               </w:rPr>
-              <w:t xml:space="preserve">  // Couleurs fonctionnelles</w:t>
+              <w:t xml:space="preserve">  static const amber      = Color(0xFFF59E0B); // Or sénégalais — CTAs, FAB</w:t>
             </w:r>
           </w:p>
           <w:p>
@@ -4210,8 +4253,13 @@
                 <w:rFonts w:ascii="Courier New" w:hAnsi="Courier New"/>
                 <w:sz w:val="17"/>
               </w:rPr>
-              <w:t xml:space="preserve">  static const green     = Color(0xFF10B981); // Succès, validations, mentors</w:t>
-            </w:r>
+              <w:t xml:space="preserve">  static const amberSoft  = Color(0xFFFCD5A0); // Fond chips amber</w:t>
+            </w:r>
+          </w:p>
+          <w:p>
+            <w:pPr>
+              <w:spacing w:before="0" w:after="0"/>
+            </w:pPr>
           </w:p>
           <w:p>
             <w:pPr>
@@ -4222,7 +4270,7 @@
                 <w:rFonts w:ascii="Courier New" w:hAnsi="Courier New"/>
                 <w:sz w:val="17"/>
               </w:rPr>
-              <w:t xml:space="preserve">  static const red       = Color(0xFFEF4444); // Erreurs, suppression</w:t>
+              <w:t xml:space="preserve">  // Couleurs fonctionnelles</w:t>
             </w:r>
           </w:p>
           <w:p>
@@ -4234,13 +4282,8 @@
                 <w:rFonts w:ascii="Courier New" w:hAnsi="Courier New"/>
                 <w:sz w:val="17"/>
               </w:rPr>
-              <w:t xml:space="preserve">  static const purple    = Color(0xFF7C3AED); // Distance GPS</w:t>
-            </w:r>
-          </w:p>
-          <w:p>
-            <w:pPr>
-              <w:spacing w:before="0" w:after="0"/>
-            </w:pPr>
+              <w:t xml:space="preserve">  static const green  = Color(0xFF10B981); // Succès, validations, mentors</w:t>
+            </w:r>
           </w:p>
           <w:p>
             <w:pPr>
@@ -4251,7 +4294,7 @@
                 <w:rFonts w:ascii="Courier New" w:hAnsi="Courier New"/>
                 <w:sz w:val="17"/>
               </w:rPr>
-              <w:t xml:space="preserve">  // Neutres</w:t>
+              <w:t xml:space="preserve">  static const red    = Color(0xFFEF4444); // Erreurs, suppression</w:t>
             </w:r>
           </w:p>
           <w:p>
@@ -4263,8 +4306,13 @@
                 <w:rFonts w:ascii="Courier New" w:hAnsi="Courier New"/>
                 <w:sz w:val="17"/>
               </w:rPr>
-              <w:t xml:space="preserve">  static const surface   = Color(0xFFF8F9FB); // Fond général de l'appli</w:t>
-            </w:r>
+              <w:t xml:space="preserve">  static const purple = Color(0xFF8B5CF6); // Distance GPS</w:t>
+            </w:r>
+          </w:p>
+          <w:p>
+            <w:pPr>
+              <w:spacing w:before="0" w:after="0"/>
+            </w:pPr>
           </w:p>
           <w:p>
             <w:pPr>
@@ -4275,7 +4323,7 @@
                 <w:rFonts w:ascii="Courier New" w:hAnsi="Courier New"/>
                 <w:sz w:val="17"/>
               </w:rPr>
-              <w:t xml:space="preserve">  static const fieldBg   = Color(0xFFF1F3F7); // Fond des champs de saisie</w:t>
+              <w:t xml:space="preserve">  // Neutres</w:t>
             </w:r>
           </w:p>
           <w:p>
@@ -4287,7 +4335,7 @@
                 <w:rFonts w:ascii="Courier New" w:hAnsi="Courier New"/>
                 <w:sz w:val="17"/>
               </w:rPr>
-              <w:t xml:space="preserve">  static const border    = Color(0xFFE2E8F0); // Bordures légères</w:t>
+              <w:t xml:space="preserve">  static const surface = Color(0xFFF8FAFC); // Fond général de l'appli</w:t>
             </w:r>
           </w:p>
           <w:p>
@@ -4299,7 +4347,7 @@
                 <w:rFonts w:ascii="Courier New" w:hAnsi="Courier New"/>
                 <w:sz w:val="17"/>
               </w:rPr>
-              <w:t xml:space="preserve">  static const muted     = Color(0xFF94A3B8); // Textes secondaires</w:t>
+              <w:t xml:space="preserve">  static const card    = Colors.white;       // Fond des cartes</w:t>
             </w:r>
           </w:p>
           <w:p>
@@ -4311,13 +4359,8 @@
                 <w:rFonts w:ascii="Courier New" w:hAnsi="Courier New"/>
                 <w:sz w:val="17"/>
               </w:rPr>
-              <w:t xml:space="preserve">  static const subtle    = Color(0xFFCBD5E1); // Icônes inactives</w:t>
-            </w:r>
-          </w:p>
-          <w:p>
-            <w:pPr>
-              <w:spacing w:before="0" w:after="0"/>
-            </w:pPr>
+              <w:t xml:space="preserve">  static const fieldBg = Color(0xFFF3F4F6); // Fond des champs de saisie</w:t>
+            </w:r>
           </w:p>
           <w:p>
             <w:pPr>
@@ -4328,7 +4371,7 @@
                 <w:rFonts w:ascii="Courier New" w:hAnsi="Courier New"/>
                 <w:sz w:val="17"/>
               </w:rPr>
-              <w:t xml:space="preserve">  // Drapeau sénégalais</w:t>
+              <w:t xml:space="preserve">  static const border  = Color(0xFFE5E7EB); // Bordures légères</w:t>
             </w:r>
           </w:p>
           <w:p>
@@ -4340,7 +4383,7 @@
                 <w:rFonts w:ascii="Courier New" w:hAnsi="Courier New"/>
                 <w:sz w:val="17"/>
               </w:rPr>
-              <w:t xml:space="preserve">  static const flagGreen  = Color(0xFF00853F);</w:t>
+              <w:t xml:space="preserve">  static const muted   = Color(0xFF6B7280); // Textes secondaires</w:t>
             </w:r>
           </w:p>
           <w:p>
@@ -4352,8 +4395,13 @@
                 <w:rFonts w:ascii="Courier New" w:hAnsi="Courier New"/>
                 <w:sz w:val="17"/>
               </w:rPr>
-              <w:t xml:space="preserve">  static const flagYellow = Color(0xFFFCDD09);</w:t>
-            </w:r>
+              <w:t xml:space="preserve">  static const subtle  = Color(0xFF9CA3AF); // Icônes inactives</w:t>
+            </w:r>
+          </w:p>
+          <w:p>
+            <w:pPr>
+              <w:spacing w:before="0" w:after="0"/>
+            </w:pPr>
           </w:p>
           <w:p>
             <w:pPr>
@@ -4364,7 +4412,173 @@
                 <w:rFonts w:ascii="Courier New" w:hAnsi="Courier New"/>
                 <w:sz w:val="17"/>
               </w:rPr>
+              <w:t xml:space="preserve">  // Couleurs des rôles (cercles d'avatar)</w:t>
+            </w:r>
+          </w:p>
+          <w:p>
+            <w:pPr>
+              <w:spacing w:before="0" w:after="0"/>
+            </w:pPr>
+            <w:r>
+              <w:rPr>
+                <w:rFonts w:ascii="Courier New" w:hAnsi="Courier New"/>
+                <w:sz w:val="17"/>
+              </w:rPr>
+              <w:t xml:space="preserve">  static const roleEntrepreneur = Color(0xFFFB7185);</w:t>
+            </w:r>
+          </w:p>
+          <w:p>
+            <w:pPr>
+              <w:spacing w:before="0" w:after="0"/>
+            </w:pPr>
+            <w:r>
+              <w:rPr>
+                <w:rFonts w:ascii="Courier New" w:hAnsi="Courier New"/>
+                <w:sz w:val="17"/>
+              </w:rPr>
+              <w:t xml:space="preserve">  static const roleMentor       = Color(0xFF22D3EE);</w:t>
+            </w:r>
+          </w:p>
+          <w:p>
+            <w:pPr>
+              <w:spacing w:before="0" w:after="0"/>
+            </w:pPr>
+            <w:r>
+              <w:rPr>
+                <w:rFonts w:ascii="Courier New" w:hAnsi="Courier New"/>
+                <w:sz w:val="17"/>
+              </w:rPr>
+              <w:t xml:space="preserve">  static const roleInvestor     = Color(0xFFF59E0B);</w:t>
+            </w:r>
+          </w:p>
+          <w:p>
+            <w:pPr>
+              <w:spacing w:before="0" w:after="0"/>
+            </w:pPr>
+          </w:p>
+          <w:p>
+            <w:pPr>
+              <w:spacing w:before="0" w:after="0"/>
+            </w:pPr>
+            <w:r>
+              <w:rPr>
+                <w:rFonts w:ascii="Courier New" w:hAnsi="Courier New"/>
+                <w:sz w:val="17"/>
+              </w:rPr>
+              <w:t xml:space="preserve">  // Drapeau sénégalais</w:t>
+            </w:r>
+          </w:p>
+          <w:p>
+            <w:pPr>
+              <w:spacing w:before="0" w:after="0"/>
+            </w:pPr>
+            <w:r>
+              <w:rPr>
+                <w:rFonts w:ascii="Courier New" w:hAnsi="Courier New"/>
+                <w:sz w:val="17"/>
+              </w:rPr>
+              <w:t xml:space="preserve">  static const flagGreen  = Color(0xFF00853F);</w:t>
+            </w:r>
+          </w:p>
+          <w:p>
+            <w:pPr>
+              <w:spacing w:before="0" w:after="0"/>
+            </w:pPr>
+            <w:r>
+              <w:rPr>
+                <w:rFonts w:ascii="Courier New" w:hAnsi="Courier New"/>
+                <w:sz w:val="17"/>
+              </w:rPr>
+              <w:t xml:space="preserve">  static const flagYellow = Color(0xFFFDEF42);</w:t>
+            </w:r>
+          </w:p>
+          <w:p>
+            <w:pPr>
+              <w:spacing w:before="0" w:after="0"/>
+            </w:pPr>
+            <w:r>
+              <w:rPr>
+                <w:rFonts w:ascii="Courier New" w:hAnsi="Courier New"/>
+                <w:sz w:val="17"/>
+              </w:rPr>
               <w:t xml:space="preserve">  static const flagRed    = Color(0xFFE31B23);</w:t>
+            </w:r>
+          </w:p>
+          <w:p>
+            <w:pPr>
+              <w:spacing w:before="0" w:after="0"/>
+            </w:pPr>
+          </w:p>
+          <w:p>
+            <w:pPr>
+              <w:spacing w:before="0" w:after="0"/>
+            </w:pPr>
+            <w:r>
+              <w:rPr>
+                <w:rFonts w:ascii="Courier New" w:hAnsi="Courier New"/>
+                <w:sz w:val="17"/>
+              </w:rPr>
+              <w:t xml:space="preserve">  // Mode sombre</w:t>
+            </w:r>
+          </w:p>
+          <w:p>
+            <w:pPr>
+              <w:spacing w:before="0" w:after="0"/>
+            </w:pPr>
+            <w:r>
+              <w:rPr>
+                <w:rFonts w:ascii="Courier New" w:hAnsi="Courier New"/>
+                <w:sz w:val="17"/>
+              </w:rPr>
+              <w:t xml:space="preserve">  static const darkSurface = Color(0xFF0B1220);</w:t>
+            </w:r>
+          </w:p>
+          <w:p>
+            <w:pPr>
+              <w:spacing w:before="0" w:after="0"/>
+            </w:pPr>
+            <w:r>
+              <w:rPr>
+                <w:rFonts w:ascii="Courier New" w:hAnsi="Courier New"/>
+                <w:sz w:val="17"/>
+              </w:rPr>
+              <w:t xml:space="preserve">  static const darkCard    = Color(0xFF111827);</w:t>
+            </w:r>
+          </w:p>
+          <w:p>
+            <w:pPr>
+              <w:spacing w:before="0" w:after="0"/>
+            </w:pPr>
+            <w:r>
+              <w:rPr>
+                <w:rFonts w:ascii="Courier New" w:hAnsi="Courier New"/>
+                <w:sz w:val="17"/>
+              </w:rPr>
+              <w:t xml:space="preserve">  static const darkBorder  = Color(0xFF1F2937);</w:t>
+            </w:r>
+          </w:p>
+          <w:p>
+            <w:pPr>
+              <w:spacing w:before="0" w:after="0"/>
+            </w:pPr>
+            <w:r>
+              <w:rPr>
+                <w:rFonts w:ascii="Courier New" w:hAnsi="Courier New"/>
+                <w:sz w:val="17"/>
+              </w:rPr>
+              <w:t xml:space="preserve">  static const darkFieldBg = Color(0xFF1F2937);</w:t>
+            </w:r>
+          </w:p>
+          <w:p>
+            <w:pPr>
+              <w:spacing w:before="0" w:after="0"/>
+            </w:pPr>
+            <w:r>
+              <w:rPr>
+                <w:rFonts w:ascii="Courier New" w:hAnsi="Courier New"/>
+                <w:sz w:val="17"/>
+              </w:rPr>
+              <w:t xml:space="preserve">  static const darkMuted   = Color(0xFF9CA3AF);</w:t>
             </w:r>
           </w:p>
           <w:p>
@@ -4763,7 +4977,7 @@
           <w:i w:val="0"/>
           <w:sz w:val="21"/>
         </w:rPr>
-        <w:t>Durée : 1.2s minimum (animation) + attente Firebase</w:t>
+        <w:t>Durée : 1.1s minimum (animation) + attente Firebase</w:t>
       </w:r>
     </w:p>
     <w:p>
@@ -5956,7 +6170,43 @@
           <w:i w:val="0"/>
           <w:sz w:val="21"/>
         </w:rPr>
-        <w:t>En-tête sticky (SliverAppBar) : avatar amber + "Bienvenue Prénom 👋" + cloche notifications + badge</w:t>
+        <w:t>En-tête gradient navy (</w:t>
+      </w:r>
+      <w:r>
+        <w:rPr>
+          <w:rFonts w:ascii="Times New Roman" w:hAnsi="Times New Roman"/>
+          <w:b w:val="0"/>
+          <w:i w:val="0"/>
+          <w:sz w:val="21"/>
+        </w:rPr>
+        <w:t>_NavyHero</w:t>
+      </w:r>
+      <w:r>
+        <w:rPr>
+          <w:rFonts w:ascii="Times New Roman" w:hAnsi="Times New Roman"/>
+          <w:b w:val="0"/>
+          <w:i w:val="0"/>
+          <w:sz w:val="21"/>
+        </w:rPr>
+        <w:t xml:space="preserve">) : avatar amber + "Bonjour 🇸🇳 + Nom complet" + cloche notifications (badge rouge dynamique via </w:t>
+      </w:r>
+      <w:r>
+        <w:rPr>
+          <w:rFonts w:ascii="Times New Roman" w:hAnsi="Times New Roman"/>
+          <w:b w:val="0"/>
+          <w:i w:val="0"/>
+          <w:sz w:val="21"/>
+        </w:rPr>
+        <w:t>NotificationService.notifications</w:t>
+      </w:r>
+      <w:r>
+        <w:rPr>
+          <w:rFonts w:ascii="Times New Roman" w:hAnsi="Times New Roman"/>
+          <w:b w:val="0"/>
+          <w:i w:val="0"/>
+          <w:sz w:val="21"/>
+        </w:rPr>
+        <w:t>)</w:t>
       </w:r>
     </w:p>
     <w:p>
@@ -5970,7 +6220,25 @@
           <w:i w:val="0"/>
           <w:sz w:val="21"/>
         </w:rPr>
-        <w:t>Skeleton loading (squelette.dart) pendant 900ms au démarrage</w:t>
+        <w:t>Barre de recherche dans l'en-tête → bascule sur l'onglet Matching (</w:t>
+      </w:r>
+      <w:r>
+        <w:rPr>
+          <w:rFonts w:ascii="Times New Roman" w:hAnsi="Times New Roman"/>
+          <w:b w:val="0"/>
+          <w:i w:val="0"/>
+          <w:sz w:val="21"/>
+        </w:rPr>
+        <w:t>appTabIndex.value = 1</w:t>
+      </w:r>
+      <w:r>
+        <w:rPr>
+          <w:rFonts w:ascii="Times New Roman" w:hAnsi="Times New Roman"/>
+          <w:b w:val="0"/>
+          <w:i w:val="0"/>
+          <w:sz w:val="21"/>
+        </w:rPr>
+        <w:t>)</w:t>
       </w:r>
     </w:p>
     <w:p>
@@ -5984,7 +6252,25 @@
           <w:i w:val="0"/>
           <w:sz w:val="21"/>
         </w:rPr>
-        <w:t>3 cartes de statistiques animées : Projets / Mentors actifs / Score</w:t>
+        <w:t>Skeleton loading (</w:t>
+      </w:r>
+      <w:r>
+        <w:rPr>
+          <w:rFonts w:ascii="Times New Roman" w:hAnsi="Times New Roman"/>
+          <w:b w:val="0"/>
+          <w:i w:val="0"/>
+          <w:sz w:val="21"/>
+        </w:rPr>
+        <w:t>squelette.dart</w:t>
+      </w:r>
+      <w:r>
+        <w:rPr>
+          <w:rFonts w:ascii="Times New Roman" w:hAnsi="Times New Roman"/>
+          <w:b w:val="0"/>
+          <w:i w:val="0"/>
+          <w:sz w:val="21"/>
+        </w:rPr>
+        <w:t>) pendant 900ms au démarrage</w:t>
       </w:r>
     </w:p>
     <w:p>
@@ -5998,7 +6284,52 @@
           <w:i w:val="0"/>
           <w:sz w:val="21"/>
         </w:rPr>
-        <w:t>Carrousel de citations d'entrepreneurs africains (auto-scroll Timer)</w:t>
+        <w:t>_ProjectHero</w:t>
+      </w:r>
+      <w:r>
+        <w:rPr>
+          <w:rFonts w:ascii="Times New Roman" w:hAnsi="Times New Roman"/>
+          <w:b w:val="0"/>
+          <w:i w:val="0"/>
+          <w:sz w:val="21"/>
+        </w:rPr>
+        <w:t xml:space="preserve"> : si aucun projet → carte "Aucun projet en cours" → </w:t>
+      </w:r>
+      <w:r>
+        <w:rPr>
+          <w:rFonts w:ascii="Times New Roman" w:hAnsi="Times New Roman"/>
+          <w:b w:val="0"/>
+          <w:i w:val="0"/>
+          <w:sz w:val="21"/>
+        </w:rPr>
+        <w:t>AddProjectPage</w:t>
+      </w:r>
+      <w:r>
+        <w:rPr>
+          <w:rFonts w:ascii="Times New Roman" w:hAnsi="Times New Roman"/>
+          <w:b w:val="0"/>
+          <w:i w:val="0"/>
+          <w:sz w:val="21"/>
+        </w:rPr>
+        <w:t xml:space="preserve"> ; si projet existant → carte de progression avec barre animée (</w:t>
+      </w:r>
+      <w:r>
+        <w:rPr>
+          <w:rFonts w:ascii="Times New Roman" w:hAnsi="Times New Roman"/>
+          <w:b w:val="0"/>
+          <w:i w:val="0"/>
+          <w:sz w:val="21"/>
+        </w:rPr>
+        <w:t>TweenAnimationBuilder</w:t>
+      </w:r>
+      <w:r>
+        <w:rPr>
+          <w:rFonts w:ascii="Times New Roman" w:hAnsi="Times New Roman"/>
+          <w:b w:val="0"/>
+          <w:i w:val="0"/>
+          <w:sz w:val="21"/>
+        </w:rPr>
+        <w:t>)</w:t>
       </w:r>
     </w:p>
     <w:p>
@@ -6012,7 +6343,25 @@
           <w:i w:val="0"/>
           <w:sz w:val="21"/>
         </w:rPr>
-        <w:t>Section "Mes projets" avec barre de progression par projet</w:t>
+        <w:t>Section "Actions rapides" — grille 2×2 (</w:t>
+      </w:r>
+      <w:r>
+        <w:rPr>
+          <w:rFonts w:ascii="Times New Roman" w:hAnsi="Times New Roman"/>
+          <w:b w:val="0"/>
+          <w:i w:val="0"/>
+          <w:sz w:val="21"/>
+        </w:rPr>
+        <w:t>_QuickActionsGrid</w:t>
+      </w:r>
+      <w:r>
+        <w:rPr>
+          <w:rFonts w:ascii="Times New Roman" w:hAnsi="Times New Roman"/>
+          <w:b w:val="0"/>
+          <w:i w:val="0"/>
+          <w:sz w:val="21"/>
+        </w:rPr>
+        <w:t>) :</w:t>
       </w:r>
     </w:p>
     <w:p>
@@ -6026,7 +6375,25 @@
           <w:i w:val="0"/>
           <w:sz w:val="21"/>
         </w:rPr>
-        <w:t>Section "Mentors recommandés" (scroll horizontal)</w:t>
+        <w:t>"Trouver un mentor" → onglet Matching (</w:t>
+      </w:r>
+      <w:r>
+        <w:rPr>
+          <w:rFonts w:ascii="Times New Roman" w:hAnsi="Times New Roman"/>
+          <w:b w:val="0"/>
+          <w:i w:val="0"/>
+          <w:sz w:val="21"/>
+        </w:rPr>
+        <w:t>appTabIndex.value = 1</w:t>
+      </w:r>
+      <w:r>
+        <w:rPr>
+          <w:rFonts w:ascii="Times New Roman" w:hAnsi="Times New Roman"/>
+          <w:b w:val="0"/>
+          <w:i w:val="0"/>
+          <w:sz w:val="21"/>
+        </w:rPr>
+        <w:t>)</w:t>
       </w:r>
     </w:p>
     <w:p>
@@ -6040,7 +6407,7 @@
           <w:i w:val="0"/>
           <w:sz w:val="21"/>
         </w:rPr>
-        <w:t xml:space="preserve">Bouton "DÉPOSER UN PITCH" → </w:t>
+        <w:t xml:space="preserve">"Déposer un pitch" → </w:t>
       </w:r>
       <w:r>
         <w:rPr>
@@ -6063,8 +6430,13 @@
           <w:i w:val="0"/>
           <w:sz w:val="21"/>
         </w:rPr>
-        <w:t xml:space="preserve">Bouton "TROUVER UN MENTOR" → </w:t>
-      </w:r>
+        <w:t>"DER / FJ Orientation" → bottom sheet d'orientation financement</w:t>
+      </w:r>
+    </w:p>
+    <w:p>
+      <w:pPr>
+        <w:pStyle w:val="ListBullet"/>
+      </w:pPr>
       <w:r>
         <w:rPr>
           <w:rFonts w:ascii="Times New Roman" w:hAnsi="Times New Roman"/>
@@ -6072,7 +6444,7 @@
           <w:i w:val="0"/>
           <w:sz w:val="21"/>
         </w:rPr>
-        <w:t>MatchingPage</w:t>
+        <w:t>"CIS Investisseurs" → bottom sheet CIS</w:t>
       </w:r>
     </w:p>
     <w:p>
@@ -6086,7 +6458,7 @@
           <w:i w:val="0"/>
           <w:sz w:val="21"/>
         </w:rPr>
-        <w:t xml:space="preserve">Bouton "MES PROJETS" → </w:t>
+        <w:t>_StatsStrip</w:t>
       </w:r>
       <w:r>
         <w:rPr>
@@ -6095,7 +6467,39 @@
           <w:i w:val="0"/>
           <w:sz w:val="21"/>
         </w:rPr>
-        <w:t>NewProjectPage</w:t>
+        <w:t xml:space="preserve"> — bande horizontale scrollable : Mentors actifs / Sessions / Score / Pitchs / Favoris (</w:t>
+      </w:r>
+      <w:r>
+        <w:rPr>
+          <w:rFonts w:ascii="Times New Roman" w:hAnsi="Times New Roman"/>
+          <w:b w:val="0"/>
+          <w:i w:val="0"/>
+          <w:sz w:val="21"/>
+        </w:rPr>
+        <w:t>AnimatedCounter</w:t>
+      </w:r>
+      <w:r>
+        <w:rPr>
+          <w:rFonts w:ascii="Times New Roman" w:hAnsi="Times New Roman"/>
+          <w:b w:val="0"/>
+          <w:i w:val="0"/>
+          <w:sz w:val="21"/>
+        </w:rPr>
+        <w:t>)</w:t>
+      </w:r>
+    </w:p>
+    <w:p>
+      <w:pPr>
+        <w:pStyle w:val="ListBullet"/>
+      </w:pPr>
+      <w:r>
+        <w:rPr>
+          <w:rFonts w:ascii="Times New Roman" w:hAnsi="Times New Roman"/>
+          <w:b w:val="0"/>
+          <w:i w:val="0"/>
+          <w:sz w:val="21"/>
+        </w:rPr>
+        <w:t>Section "Mentors pour toi" → bandeau "Recommandations bientôt disponibles" (fonctionnalité prévue)</w:t>
       </w:r>
     </w:p>
     <w:p>
@@ -6244,7 +6648,7 @@
           <w:i w:val="0"/>
           <w:sz w:val="21"/>
         </w:rPr>
-        <w:t>3 cartes stats : Mentorés actifs / Sessions / Score</w:t>
+        <w:t>3 cartes stats : Mentorés / Sessions / Années d'expérience</w:t>
       </w:r>
     </w:p>
     <w:p>
@@ -6286,7 +6690,7 @@
           <w:i w:val="0"/>
           <w:sz w:val="21"/>
         </w:rPr>
-        <w:t>Accès rapide : Messages, Agenda, Demandes reçues, Mon Planning, Pitchs publiés</w:t>
+        <w:t>Accès rapide : Demandes reçues, Mon Planning, Pitchs publiés (Messages et Agenda sont accessibles via les onglets de la barre de navigation principale)</w:t>
       </w:r>
     </w:p>
     <w:p>
@@ -6449,7 +6853,7 @@
           <w:i w:val="0"/>
           <w:sz w:val="21"/>
         </w:rPr>
-        <w:t>Accès rapide : Explorer la communauté, Pitchs reçus (StreamBuilder), Messages, Mon Agenda</w:t>
+        <w:t>Accès rapide : Explorer la communauté, Pitchs reçus (StreamBuilder) (Messages et Agenda accessibles via les onglets de la barre de navigation principale)</w:t>
       </w:r>
     </w:p>
     <w:p>
@@ -6677,7 +7081,7 @@
           <w:i w:val="0"/>
           <w:sz w:val="21"/>
         </w:rPr>
-        <w:t>100+ profils sénégalais statiques en complément</w:t>
+        <w:t>112 profils sénégalais statiques en complément</w:t>
       </w:r>
     </w:p>
     <w:p>
@@ -6691,7 +7095,7 @@
           <w:i w:val="0"/>
           <w:sz w:val="21"/>
         </w:rPr>
-        <w:t>Tri automatique : membres réels en priorité, puis par compatibilité</w:t>
+        <w:t>Tri automatique : membres réels en priorité, puis par compatibilité dynamique (intérêts partagés)</w:t>
       </w:r>
     </w:p>
     <w:p>
@@ -6720,6 +7124,71 @@
           <w:sz w:val="21"/>
         </w:rPr>
         <w:t>Bouton "Réinitialiser" si filtres actifs</w:t>
+      </w:r>
+    </w:p>
+    <w:p>
+      <w:pPr>
+        <w:pStyle w:val="ListBullet"/>
+      </w:pPr>
+      <w:r>
+        <w:rPr>
+          <w:rFonts w:ascii="Times New Roman" w:hAnsi="Times New Roman"/>
+          <w:b w:val="0"/>
+          <w:i w:val="0"/>
+          <w:sz w:val="21"/>
+        </w:rPr>
+        <w:t>Titre et contenu adaptés selon le rôle connecté</w:t>
+      </w:r>
+      <w:r>
+        <w:rPr>
+          <w:rFonts w:ascii="Times New Roman" w:hAnsi="Times New Roman"/>
+          <w:b w:val="0"/>
+          <w:i w:val="0"/>
+          <w:sz w:val="21"/>
+        </w:rPr>
+        <w:t xml:space="preserve"> :</w:t>
+      </w:r>
+    </w:p>
+    <w:p>
+      <w:pPr>
+        <w:pStyle w:val="ListBullet"/>
+      </w:pPr>
+      <w:r>
+        <w:rPr>
+          <w:rFonts w:ascii="Times New Roman" w:hAnsi="Times New Roman"/>
+          <w:b w:val="0"/>
+          <w:i w:val="0"/>
+          <w:sz w:val="21"/>
+        </w:rPr>
+        <w:t>Entrepreneur → voit Mentors + Investisseurs</w:t>
+      </w:r>
+    </w:p>
+    <w:p>
+      <w:pPr>
+        <w:pStyle w:val="ListBullet"/>
+      </w:pPr>
+      <w:r>
+        <w:rPr>
+          <w:rFonts w:ascii="Times New Roman" w:hAnsi="Times New Roman"/>
+          <w:b w:val="0"/>
+          <w:i w:val="0"/>
+          <w:sz w:val="21"/>
+        </w:rPr>
+        <w:t>Mentor → titre "Mes Entrepreneurs", voit les Entrepreneurs</w:t>
+      </w:r>
+    </w:p>
+    <w:p>
+      <w:pPr>
+        <w:pStyle w:val="ListBullet"/>
+      </w:pPr>
+      <w:r>
+        <w:rPr>
+          <w:rFonts w:ascii="Times New Roman" w:hAnsi="Times New Roman"/>
+          <w:b w:val="0"/>
+          <w:i w:val="0"/>
+          <w:sz w:val="21"/>
+        </w:rPr>
+        <w:t>Investisseur → titre "Entrepreneurs à financer", voit les Entrepreneurs</w:t>
       </w:r>
     </w:p>
     <w:p>
@@ -6868,7 +7337,34 @@
           <w:i w:val="0"/>
           <w:sz w:val="21"/>
         </w:rPr>
-        <w:t>Biographie complète</w:t>
+        <w:t xml:space="preserve">Biographie : utilise </w:t>
+      </w:r>
+      <w:r>
+        <w:rPr>
+          <w:rFonts w:ascii="Times New Roman" w:hAnsi="Times New Roman"/>
+          <w:b w:val="0"/>
+          <w:i w:val="0"/>
+          <w:sz w:val="21"/>
+        </w:rPr>
+        <w:t>mentor.bio</w:t>
+      </w:r>
+      <w:r>
+        <w:rPr>
+          <w:rFonts w:ascii="Times New Roman" w:hAnsi="Times New Roman"/>
+          <w:b w:val="0"/>
+          <w:i w:val="0"/>
+          <w:sz w:val="21"/>
+        </w:rPr>
+        <w:t xml:space="preserve"> si non vide (membres Firebase), sinon génère une bio avec le bon pronom selon </w:t>
+      </w:r>
+      <w:r>
+        <w:rPr>
+          <w:rFonts w:ascii="Times New Roman" w:hAnsi="Times New Roman"/>
+          <w:b w:val="0"/>
+          <w:i w:val="0"/>
+          <w:sz w:val="21"/>
+        </w:rPr>
+        <w:t>mentor.gender</w:t>
       </w:r>
     </w:p>
     <w:p>
@@ -6910,7 +7406,7 @@
           <w:i w:val="0"/>
           <w:sz w:val="21"/>
         </w:rPr>
-        <w:t xml:space="preserve">Bouton "Envoyer une demande" → </w:t>
+        <w:t>Section "Disponibilités"</w:t>
       </w:r>
       <w:r>
         <w:rPr>
@@ -6919,7 +7415,7 @@
           <w:i w:val="0"/>
           <w:sz w:val="21"/>
         </w:rPr>
-        <w:t>SendRequestPage</w:t>
+        <w:t xml:space="preserve"> — widget </w:t>
       </w:r>
       <w:r>
         <w:rPr>
@@ -6928,7 +7424,16 @@
           <w:i w:val="0"/>
           <w:sz w:val="21"/>
         </w:rPr>
-        <w:t xml:space="preserve"> (demande de mentorat Firebase)</w:t>
+        <w:t>_AvailabilityPreview</w:t>
+      </w:r>
+      <w:r>
+        <w:rPr>
+          <w:rFonts w:ascii="Times New Roman" w:hAnsi="Times New Roman"/>
+          <w:b w:val="0"/>
+          <w:i w:val="0"/>
+          <w:sz w:val="21"/>
+        </w:rPr>
+        <w:t xml:space="preserve"> :</w:t>
       </w:r>
     </w:p>
     <w:p>
@@ -6942,8 +7447,13 @@
           <w:i w:val="0"/>
           <w:sz w:val="21"/>
         </w:rPr>
-        <w:t xml:space="preserve">Bouton "Contacter" → </w:t>
-      </w:r>
+        <w:t>Profils démo (uid vide) → badges "Exemple" (point gris) — données illustratives</w:t>
+      </w:r>
+    </w:p>
+    <w:p>
+      <w:pPr>
+        <w:pStyle w:val="ListBullet"/>
+      </w:pPr>
       <w:r>
         <w:rPr>
           <w:rFonts w:ascii="Times New Roman" w:hAnsi="Times New Roman"/>
@@ -6951,7 +7461,7 @@
           <w:i w:val="0"/>
           <w:sz w:val="21"/>
         </w:rPr>
-        <w:t>ChatPage</w:t>
+        <w:t xml:space="preserve">Membres Firebase → vraies disponibilités lues en temps réel via </w:t>
       </w:r>
       <w:r>
         <w:rPr>
@@ -6960,7 +7470,213 @@
           <w:i w:val="0"/>
           <w:sz w:val="21"/>
         </w:rPr>
-        <w:t xml:space="preserve"> (messagerie Firebase)</w:t>
+        <w:t>InteractionsService.getAvailability(mentor.uid)</w:t>
+      </w:r>
+      <w:r>
+        <w:rPr>
+          <w:rFonts w:ascii="Times New Roman" w:hAnsi="Times New Roman"/>
+          <w:b w:val="0"/>
+          <w:i w:val="0"/>
+          <w:sz w:val="21"/>
+        </w:rPr>
+        <w:t xml:space="preserve"> (StreamBuilder)</w:t>
+      </w:r>
+    </w:p>
+    <w:p>
+      <w:pPr>
+        <w:pStyle w:val="ListBullet"/>
+      </w:pPr>
+      <w:r>
+        <w:rPr>
+          <w:rFonts w:ascii="Times New Roman" w:hAnsi="Times New Roman"/>
+          <w:b w:val="0"/>
+          <w:i w:val="0"/>
+          <w:sz w:val="21"/>
+        </w:rPr>
+        <w:t>Message "Disponibilités non encore configurées." si aucun créneau Firebase</w:t>
+      </w:r>
+    </w:p>
+    <w:p>
+      <w:pPr>
+        <w:pStyle w:val="ListBullet"/>
+      </w:pPr>
+      <w:r>
+        <w:rPr>
+          <w:rFonts w:ascii="Times New Roman" w:hAnsi="Times New Roman"/>
+          <w:b w:val="0"/>
+          <w:i w:val="0"/>
+          <w:sz w:val="21"/>
+        </w:rPr>
+        <w:t>Bouton d'action adapté selon le rôle du profil consulté</w:t>
+      </w:r>
+      <w:r>
+        <w:rPr>
+          <w:rFonts w:ascii="Times New Roman" w:hAnsi="Times New Roman"/>
+          <w:b w:val="0"/>
+          <w:i w:val="0"/>
+          <w:sz w:val="21"/>
+        </w:rPr>
+        <w:t xml:space="preserve"> :</w:t>
+      </w:r>
+    </w:p>
+    <w:p>
+      <w:pPr>
+        <w:pStyle w:val="ListBullet"/>
+      </w:pPr>
+      <w:r>
+        <w:rPr>
+          <w:rFonts w:ascii="Times New Roman" w:hAnsi="Times New Roman"/>
+          <w:b w:val="0"/>
+          <w:i w:val="0"/>
+          <w:sz w:val="21"/>
+        </w:rPr>
+        <w:t xml:space="preserve">Si Mentor → "Réserver une session" → </w:t>
+      </w:r>
+      <w:r>
+        <w:rPr>
+          <w:rFonts w:ascii="Times New Roman" w:hAnsi="Times New Roman"/>
+          <w:b w:val="0"/>
+          <w:i w:val="0"/>
+          <w:sz w:val="21"/>
+        </w:rPr>
+        <w:t>_BookingSheet</w:t>
+      </w:r>
+      <w:r>
+        <w:rPr>
+          <w:rFonts w:ascii="Times New Roman" w:hAnsi="Times New Roman"/>
+          <w:b w:val="0"/>
+          <w:i w:val="0"/>
+          <w:sz w:val="21"/>
+        </w:rPr>
+        <w:t xml:space="preserve"> (calendrier Firebase réel)</w:t>
+      </w:r>
+    </w:p>
+    <w:p>
+      <w:pPr>
+        <w:pStyle w:val="ListBullet"/>
+      </w:pPr>
+      <w:r>
+        <w:rPr>
+          <w:rFonts w:ascii="Times New Roman" w:hAnsi="Times New Roman"/>
+          <w:b w:val="0"/>
+          <w:i w:val="0"/>
+          <w:sz w:val="21"/>
+        </w:rPr>
+        <w:t xml:space="preserve">Si Investisseur → "Proposer un investissement" (type </w:t>
+      </w:r>
+      <w:r>
+        <w:rPr>
+          <w:rFonts w:ascii="Times New Roman" w:hAnsi="Times New Roman"/>
+          <w:b w:val="0"/>
+          <w:i w:val="0"/>
+          <w:sz w:val="21"/>
+        </w:rPr>
+        <w:t>'investment'</w:t>
+      </w:r>
+      <w:r>
+        <w:rPr>
+          <w:rFonts w:ascii="Times New Roman" w:hAnsi="Times New Roman"/>
+          <w:b w:val="0"/>
+          <w:i w:val="0"/>
+          <w:sz w:val="21"/>
+        </w:rPr>
+        <w:t>)</w:t>
+      </w:r>
+    </w:p>
+    <w:p>
+      <w:pPr>
+        <w:pStyle w:val="ListBullet"/>
+      </w:pPr>
+      <w:r>
+        <w:rPr>
+          <w:rFonts w:ascii="Times New Roman" w:hAnsi="Times New Roman"/>
+          <w:b w:val="0"/>
+          <w:i w:val="0"/>
+          <w:sz w:val="21"/>
+        </w:rPr>
+        <w:t>Visible pour tous les profils (pas seulement les membres Firebase)</w:t>
+      </w:r>
+    </w:p>
+    <w:p>
+      <w:pPr>
+        <w:pStyle w:val="ListBullet"/>
+      </w:pPr>
+      <w:r>
+        <w:rPr>
+          <w:rFonts w:ascii="Times New Roman" w:hAnsi="Times New Roman"/>
+          <w:b w:val="0"/>
+          <w:i w:val="0"/>
+          <w:sz w:val="21"/>
+        </w:rPr>
+        <w:t>Bouton "Message"</w:t>
+      </w:r>
+      <w:r>
+        <w:rPr>
+          <w:rFonts w:ascii="Times New Roman" w:hAnsi="Times New Roman"/>
+          <w:b w:val="0"/>
+          <w:i w:val="0"/>
+          <w:sz w:val="21"/>
+        </w:rPr>
+        <w:t xml:space="preserve"> — ID de conversation généré avec </w:t>
+      </w:r>
+      <w:r>
+        <w:rPr>
+          <w:rFonts w:ascii="Times New Roman" w:hAnsi="Times New Roman"/>
+          <w:b w:val="0"/>
+          <w:i w:val="0"/>
+          <w:sz w:val="21"/>
+        </w:rPr>
+        <w:t>AuthService.currentUid</w:t>
+      </w:r>
+      <w:r>
+        <w:rPr>
+          <w:rFonts w:ascii="Times New Roman" w:hAnsi="Times New Roman"/>
+          <w:b w:val="0"/>
+          <w:i w:val="0"/>
+          <w:sz w:val="21"/>
+        </w:rPr>
+        <w:t xml:space="preserve"> (UID Firebase, jamais l'email) pour cohérence avec </w:t>
+      </w:r>
+      <w:r>
+        <w:rPr>
+          <w:rFonts w:ascii="Times New Roman" w:hAnsi="Times New Roman"/>
+          <w:b w:val="0"/>
+          <w:i w:val="0"/>
+          <w:sz w:val="21"/>
+        </w:rPr>
+        <w:t>page_notifications.dart</w:t>
+      </w:r>
+    </w:p>
+    <w:p>
+      <w:pPr>
+        <w:pStyle w:val="ListBullet"/>
+      </w:pPr>
+      <w:r>
+        <w:rPr>
+          <w:rFonts w:ascii="Times New Roman" w:hAnsi="Times New Roman"/>
+          <w:b w:val="0"/>
+          <w:i w:val="0"/>
+          <w:sz w:val="21"/>
+        </w:rPr>
+        <w:t>Logique de communication stricte : chat disponible seulement après acceptation de la demande (</w:t>
+      </w:r>
+      <w:r>
+        <w:rPr>
+          <w:rFonts w:ascii="Times New Roman" w:hAnsi="Times New Roman"/>
+          <w:b w:val="0"/>
+          <w:i w:val="0"/>
+          <w:sz w:val="21"/>
+        </w:rPr>
+        <w:t>_checkRequestStatus()</w:t>
+      </w:r>
+      <w:r>
+        <w:rPr>
+          <w:rFonts w:ascii="Times New Roman" w:hAnsi="Times New Roman"/>
+          <w:b w:val="0"/>
+          <w:i w:val="0"/>
+          <w:sz w:val="21"/>
+        </w:rPr>
+        <w:t xml:space="preserve"> bidirectionnel)</w:t>
       </w:r>
     </w:p>
     <w:p>
@@ -7090,6 +7806,52 @@
     </w:p>
     <w:p>
       <w:pPr>
+        <w:spacing w:after="120"/>
+      </w:pPr>
+      <w:r>
+        <w:rPr>
+          <w:rFonts w:ascii="Times New Roman" w:hAnsi="Times New Roman"/>
+          <w:b w:val="0"/>
+          <w:i w:val="0"/>
+          <w:sz w:val="22"/>
+        </w:rPr>
+        <w:t xml:space="preserve">La page Messages est organisée en </w:t>
+      </w:r>
+      <w:r>
+        <w:rPr>
+          <w:rFonts w:ascii="Times New Roman" w:hAnsi="Times New Roman"/>
+          <w:b w:val="0"/>
+          <w:i w:val="0"/>
+          <w:sz w:val="22"/>
+        </w:rPr>
+        <w:t>2 onglets</w:t>
+      </w:r>
+      <w:r>
+        <w:rPr>
+          <w:rFonts w:ascii="Times New Roman" w:hAnsi="Times New Roman"/>
+          <w:b w:val="0"/>
+          <w:i w:val="0"/>
+          <w:sz w:val="22"/>
+        </w:rPr>
+        <w:t xml:space="preserve"> :</w:t>
+      </w:r>
+    </w:p>
+    <w:p>
+      <w:pPr>
+        <w:spacing w:after="120"/>
+      </w:pPr>
+      <w:r>
+        <w:rPr>
+          <w:rFonts w:ascii="Times New Roman" w:hAnsi="Times New Roman"/>
+          <w:b w:val="0"/>
+          <w:i w:val="0"/>
+          <w:sz w:val="22"/>
+        </w:rPr>
+        <w:t>Onglet "Contacts" :</w:t>
+      </w:r>
+    </w:p>
+    <w:p>
+      <w:pPr>
         <w:pStyle w:val="ListBullet"/>
       </w:pPr>
       <w:r>
@@ -7099,7 +7861,77 @@
           <w:i w:val="0"/>
           <w:sz w:val="21"/>
         </w:rPr>
-        <w:t>Liste de toutes les conversations (StreamBuilder Firebase temps réel)</w:t>
+        <w:t>Liste des relations acceptées : mentor/mentoré ou investisseur/entrepreneur</w:t>
+      </w:r>
+    </w:p>
+    <w:p>
+      <w:pPr>
+        <w:pStyle w:val="ListBullet"/>
+      </w:pPr>
+      <w:r>
+        <w:rPr>
+          <w:rFonts w:ascii="Times New Roman" w:hAnsi="Times New Roman"/>
+          <w:b w:val="0"/>
+          <w:i w:val="0"/>
+          <w:sz w:val="21"/>
+        </w:rPr>
+        <w:t>Searchable par nom</w:t>
+      </w:r>
+    </w:p>
+    <w:p>
+      <w:pPr>
+        <w:pStyle w:val="ListBullet"/>
+      </w:pPr>
+      <w:r>
+        <w:rPr>
+          <w:rFonts w:ascii="Times New Roman" w:hAnsi="Times New Roman"/>
+          <w:b w:val="0"/>
+          <w:i w:val="0"/>
+          <w:sz w:val="21"/>
+        </w:rPr>
+        <w:t>Chip badge coloré indiquant le rôle du contact</w:t>
+      </w:r>
+    </w:p>
+    <w:p>
+      <w:pPr>
+        <w:pStyle w:val="ListBullet"/>
+      </w:pPr>
+      <w:r>
+        <w:rPr>
+          <w:rFonts w:ascii="Times New Roman" w:hAnsi="Times New Roman"/>
+          <w:b w:val="0"/>
+          <w:i w:val="0"/>
+          <w:sz w:val="21"/>
+        </w:rPr>
+        <w:t>Tap → ouvre le chat direct avec ce contact</w:t>
+      </w:r>
+    </w:p>
+    <w:p>
+      <w:pPr>
+        <w:spacing w:after="120"/>
+      </w:pPr>
+      <w:r>
+        <w:rPr>
+          <w:rFonts w:ascii="Times New Roman" w:hAnsi="Times New Roman"/>
+          <w:b w:val="0"/>
+          <w:i w:val="0"/>
+          <w:sz w:val="22"/>
+        </w:rPr>
+        <w:t>Onglet "Messages" :</w:t>
+      </w:r>
+    </w:p>
+    <w:p>
+      <w:pPr>
+        <w:pStyle w:val="ListBullet"/>
+      </w:pPr>
+      <w:r>
+        <w:rPr>
+          <w:rFonts w:ascii="Times New Roman" w:hAnsi="Times New Roman"/>
+          <w:b w:val="0"/>
+          <w:i w:val="0"/>
+          <w:sz w:val="21"/>
+        </w:rPr>
+        <w:t>Liste de toutes les conversations existantes (StreamBuilder Firebase temps réel)</w:t>
       </w:r>
     </w:p>
     <w:p>
@@ -7524,6 +8356,259 @@
           <w:i w:val="0"/>
           <w:sz w:val="21"/>
         </w:rPr>
+        <w:t>Navigation contextuelle au tap</w:t>
+      </w:r>
+      <w:r>
+        <w:rPr>
+          <w:rFonts w:ascii="Times New Roman" w:hAnsi="Times New Roman"/>
+          <w:b w:val="0"/>
+          <w:i w:val="0"/>
+          <w:sz w:val="21"/>
+        </w:rPr>
+        <w:t xml:space="preserve"> selon le type de notification : </w:t>
+      </w:r>
+      <w:r>
+        <w:rPr>
+          <w:rFonts w:ascii="Times New Roman" w:hAnsi="Times New Roman"/>
+          <w:b w:val="0"/>
+          <w:i w:val="0"/>
+          <w:sz w:val="21"/>
+        </w:rPr>
+        <w:t>message</w:t>
+      </w:r>
+      <w:r>
+        <w:rPr>
+          <w:rFonts w:ascii="Times New Roman" w:hAnsi="Times New Roman"/>
+          <w:b w:val="0"/>
+          <w:i w:val="0"/>
+          <w:sz w:val="21"/>
+        </w:rPr>
+        <w:t xml:space="preserve"> → onglet Messages, </w:t>
+      </w:r>
+      <w:r>
+        <w:rPr>
+          <w:rFonts w:ascii="Times New Roman" w:hAnsi="Times New Roman"/>
+          <w:b w:val="0"/>
+          <w:i w:val="0"/>
+          <w:sz w:val="21"/>
+        </w:rPr>
+        <w:t>session_booked</w:t>
+      </w:r>
+      <w:r>
+        <w:rPr>
+          <w:rFonts w:ascii="Times New Roman" w:hAnsi="Times New Roman"/>
+          <w:b w:val="0"/>
+          <w:i w:val="0"/>
+          <w:sz w:val="21"/>
+        </w:rPr>
+        <w:t xml:space="preserve"> / </w:t>
+      </w:r>
+      <w:r>
+        <w:rPr>
+          <w:rFonts w:ascii="Times New Roman" w:hAnsi="Times New Roman"/>
+          <w:b w:val="0"/>
+          <w:i w:val="0"/>
+          <w:sz w:val="21"/>
+        </w:rPr>
+        <w:t>rdv_booked</w:t>
+      </w:r>
+      <w:r>
+        <w:rPr>
+          <w:rFonts w:ascii="Times New Roman" w:hAnsi="Times New Roman"/>
+          <w:b w:val="0"/>
+          <w:i w:val="0"/>
+          <w:sz w:val="21"/>
+        </w:rPr>
+        <w:t xml:space="preserve"> / </w:t>
+      </w:r>
+      <w:r>
+        <w:rPr>
+          <w:rFonts w:ascii="Times New Roman" w:hAnsi="Times New Roman"/>
+          <w:b w:val="0"/>
+          <w:i w:val="0"/>
+          <w:sz w:val="21"/>
+        </w:rPr>
+        <w:t>session_cancelled</w:t>
+      </w:r>
+      <w:r>
+        <w:rPr>
+          <w:rFonts w:ascii="Times New Roman" w:hAnsi="Times New Roman"/>
+          <w:b w:val="0"/>
+          <w:i w:val="0"/>
+          <w:sz w:val="21"/>
+        </w:rPr>
+        <w:t xml:space="preserve"> → onglet Agenda, </w:t>
+      </w:r>
+      <w:r>
+        <w:rPr>
+          <w:rFonts w:ascii="Times New Roman" w:hAnsi="Times New Roman"/>
+          <w:b w:val="0"/>
+          <w:i w:val="0"/>
+          <w:sz w:val="21"/>
+        </w:rPr>
+        <w:t>mentor_request</w:t>
+      </w:r>
+      <w:r>
+        <w:rPr>
+          <w:rFonts w:ascii="Times New Roman" w:hAnsi="Times New Roman"/>
+          <w:b w:val="0"/>
+          <w:i w:val="0"/>
+          <w:sz w:val="21"/>
+        </w:rPr>
+        <w:t xml:space="preserve"> / </w:t>
+      </w:r>
+      <w:r>
+        <w:rPr>
+          <w:rFonts w:ascii="Times New Roman" w:hAnsi="Times New Roman"/>
+          <w:b w:val="0"/>
+          <w:i w:val="0"/>
+          <w:sz w:val="21"/>
+        </w:rPr>
+        <w:t>mentor_request_accepted</w:t>
+      </w:r>
+      <w:r>
+        <w:rPr>
+          <w:rFonts w:ascii="Times New Roman" w:hAnsi="Times New Roman"/>
+          <w:b w:val="0"/>
+          <w:i w:val="0"/>
+          <w:sz w:val="21"/>
+        </w:rPr>
+        <w:t xml:space="preserve"> / </w:t>
+      </w:r>
+      <w:r>
+        <w:rPr>
+          <w:rFonts w:ascii="Times New Roman" w:hAnsi="Times New Roman"/>
+          <w:b w:val="0"/>
+          <w:i w:val="0"/>
+          <w:sz w:val="21"/>
+        </w:rPr>
+        <w:t>mentor_request_rejected</w:t>
+      </w:r>
+      <w:r>
+        <w:rPr>
+          <w:rFonts w:ascii="Times New Roman" w:hAnsi="Times New Roman"/>
+          <w:b w:val="0"/>
+          <w:i w:val="0"/>
+          <w:sz w:val="21"/>
+        </w:rPr>
+        <w:t xml:space="preserve"> / </w:t>
+      </w:r>
+      <w:r>
+        <w:rPr>
+          <w:rFonts w:ascii="Times New Roman" w:hAnsi="Times New Roman"/>
+          <w:b w:val="0"/>
+          <w:i w:val="0"/>
+          <w:sz w:val="21"/>
+        </w:rPr>
+        <w:t>investment_offer</w:t>
+      </w:r>
+      <w:r>
+        <w:rPr>
+          <w:rFonts w:ascii="Times New Roman" w:hAnsi="Times New Roman"/>
+          <w:b w:val="0"/>
+          <w:i w:val="0"/>
+          <w:sz w:val="21"/>
+        </w:rPr>
+        <w:t xml:space="preserve"> → page Demandes (</w:t>
+      </w:r>
+      <w:r>
+        <w:rPr>
+          <w:rFonts w:ascii="Times New Roman" w:hAnsi="Times New Roman"/>
+          <w:b w:val="0"/>
+          <w:i w:val="0"/>
+          <w:sz w:val="21"/>
+        </w:rPr>
+        <w:t>RequestsPage</w:t>
+      </w:r>
+      <w:r>
+        <w:rPr>
+          <w:rFonts w:ascii="Times New Roman" w:hAnsi="Times New Roman"/>
+          <w:b w:val="0"/>
+          <w:i w:val="0"/>
+          <w:sz w:val="21"/>
+        </w:rPr>
+        <w:t>)</w:t>
+      </w:r>
+    </w:p>
+    <w:p>
+      <w:pPr>
+        <w:pStyle w:val="ListBullet"/>
+      </w:pPr>
+      <w:r>
+        <w:rPr>
+          <w:rFonts w:ascii="Times New Roman" w:hAnsi="Times New Roman"/>
+          <w:b w:val="0"/>
+          <w:i w:val="0"/>
+          <w:sz w:val="21"/>
+        </w:rPr>
+        <w:t>Actions inline Accept/Décline</w:t>
+      </w:r>
+      <w:r>
+        <w:rPr>
+          <w:rFonts w:ascii="Times New Roman" w:hAnsi="Times New Roman"/>
+          <w:b w:val="0"/>
+          <w:i w:val="0"/>
+          <w:sz w:val="21"/>
+        </w:rPr>
+        <w:t xml:space="preserve"> pour les types </w:t>
+      </w:r>
+      <w:r>
+        <w:rPr>
+          <w:rFonts w:ascii="Times New Roman" w:hAnsi="Times New Roman"/>
+          <w:b w:val="0"/>
+          <w:i w:val="0"/>
+          <w:sz w:val="21"/>
+        </w:rPr>
+        <w:t>investment_offer</w:t>
+      </w:r>
+      <w:r>
+        <w:rPr>
+          <w:rFonts w:ascii="Times New Roman" w:hAnsi="Times New Roman"/>
+          <w:b w:val="0"/>
+          <w:i w:val="0"/>
+          <w:sz w:val="21"/>
+        </w:rPr>
+        <w:t xml:space="preserve"> et </w:t>
+      </w:r>
+      <w:r>
+        <w:rPr>
+          <w:rFonts w:ascii="Times New Roman" w:hAnsi="Times New Roman"/>
+          <w:b w:val="0"/>
+          <w:i w:val="0"/>
+          <w:sz w:val="21"/>
+        </w:rPr>
+        <w:t>session_request</w:t>
+      </w:r>
+      <w:r>
+        <w:rPr>
+          <w:rFonts w:ascii="Times New Roman" w:hAnsi="Times New Roman"/>
+          <w:b w:val="0"/>
+          <w:i w:val="0"/>
+          <w:sz w:val="21"/>
+        </w:rPr>
+        <w:t xml:space="preserve"> : boutons "Accepter" / "Refuser" directement dans la tuile sans naviguer vers </w:t>
+      </w:r>
+      <w:r>
+        <w:rPr>
+          <w:rFonts w:ascii="Times New Roman" w:hAnsi="Times New Roman"/>
+          <w:b w:val="0"/>
+          <w:i w:val="0"/>
+          <w:sz w:val="21"/>
+        </w:rPr>
+        <w:t>RequestsPage</w:t>
+      </w:r>
+    </w:p>
+    <w:p>
+      <w:pPr>
+        <w:pStyle w:val="ListBullet"/>
+      </w:pPr>
+      <w:r>
+        <w:rPr>
+          <w:rFonts w:ascii="Times New Roman" w:hAnsi="Times New Roman"/>
+          <w:b w:val="0"/>
+          <w:i w:val="0"/>
+          <w:sz w:val="21"/>
+        </w:rPr>
         <w:t xml:space="preserve">Bouton </w:t>
       </w:r>
       <w:r>
@@ -7903,7 +8988,7 @@
           <w:i w:val="0"/>
           <w:sz w:val="21"/>
         </w:rPr>
-        <w:t>Entrepreneur → "Mes demandes" (envoyées)</w:t>
+        <w:t>Entrepreneur → "Mes contacts" (relations acceptées — mentorat + investissement)</w:t>
       </w:r>
     </w:p>
     <w:p>
@@ -8627,6 +9712,98 @@
           <w:i w:val="0"/>
           <w:sz w:val="21"/>
         </w:rPr>
+        <w:t>Barre de recherche</w:t>
+      </w:r>
+      <w:r>
+        <w:rPr>
+          <w:rFonts w:ascii="Times New Roman" w:hAnsi="Times New Roman"/>
+          <w:b w:val="0"/>
+          <w:i w:val="0"/>
+          <w:sz w:val="21"/>
+        </w:rPr>
+        <w:t xml:space="preserve"> : filtre en temps réel (titre, entrepreneur, secteur, description)</w:t>
+      </w:r>
+    </w:p>
+    <w:p>
+      <w:pPr>
+        <w:pStyle w:val="ListBullet"/>
+      </w:pPr>
+      <w:r>
+        <w:rPr>
+          <w:rFonts w:ascii="Times New Roman" w:hAnsi="Times New Roman"/>
+          <w:b w:val="0"/>
+          <w:i w:val="0"/>
+          <w:sz w:val="21"/>
+        </w:rPr>
+        <w:t>Pills de secteur</w:t>
+      </w:r>
+      <w:r>
+        <w:rPr>
+          <w:rFonts w:ascii="Times New Roman" w:hAnsi="Times New Roman"/>
+          <w:b w:val="0"/>
+          <w:i w:val="0"/>
+          <w:sz w:val="21"/>
+        </w:rPr>
+        <w:t xml:space="preserve"> générées dynamiquement depuis les pitchs Firebase</w:t>
+      </w:r>
+    </w:p>
+    <w:p>
+      <w:pPr>
+        <w:pStyle w:val="ListBullet"/>
+      </w:pPr>
+      <w:r>
+        <w:rPr>
+          <w:rFonts w:ascii="Times New Roman" w:hAnsi="Times New Roman"/>
+          <w:b w:val="0"/>
+          <w:i w:val="0"/>
+          <w:sz w:val="21"/>
+        </w:rPr>
+        <w:t>Compteur</w:t>
+      </w:r>
+      <w:r>
+        <w:rPr>
+          <w:rFonts w:ascii="Times New Roman" w:hAnsi="Times New Roman"/>
+          <w:b w:val="0"/>
+          <w:i w:val="0"/>
+          <w:sz w:val="21"/>
+        </w:rPr>
+        <w:t xml:space="preserve"> "X pitch(s)" mis à jour selon les filtres actifs</w:t>
+      </w:r>
+    </w:p>
+    <w:p>
+      <w:pPr>
+        <w:pStyle w:val="ListBullet"/>
+      </w:pPr>
+      <w:r>
+        <w:rPr>
+          <w:rFonts w:ascii="Times New Roman" w:hAnsi="Times New Roman"/>
+          <w:b w:val="0"/>
+          <w:i w:val="0"/>
+          <w:sz w:val="21"/>
+        </w:rPr>
+        <w:t>Bouton "Réinitialiser"</w:t>
+      </w:r>
+      <w:r>
+        <w:rPr>
+          <w:rFonts w:ascii="Times New Roman" w:hAnsi="Times New Roman"/>
+          <w:b w:val="0"/>
+          <w:i w:val="0"/>
+          <w:sz w:val="21"/>
+        </w:rPr>
+        <w:t xml:space="preserve"> visible si un filtre est actif</w:t>
+      </w:r>
+    </w:p>
+    <w:p>
+      <w:pPr>
+        <w:pStyle w:val="ListBullet"/>
+      </w:pPr>
+      <w:r>
+        <w:rPr>
+          <w:rFonts w:ascii="Times New Roman" w:hAnsi="Times New Roman"/>
+          <w:b w:val="0"/>
+          <w:i w:val="0"/>
+          <w:sz w:val="21"/>
+        </w:rPr>
         <w:t>Chaque carte : avatar entrepreneur, nom, secteur (chip amber), titre, description (3 lignes max), montant FCFA</w:t>
       </w:r>
     </w:p>
@@ -8642,6 +9819,65 @@
           <w:sz w:val="21"/>
         </w:rPr>
         <w:t>Bouton "Contacter →" → Messagerie</w:t>
+      </w:r>
+    </w:p>
+    <w:p>
+      <w:pPr>
+        <w:pStyle w:val="ListBullet"/>
+      </w:pPr>
+      <w:r>
+        <w:rPr>
+          <w:rFonts w:ascii="Times New Roman" w:hAnsi="Times New Roman"/>
+          <w:b w:val="0"/>
+          <w:i w:val="0"/>
+          <w:sz w:val="21"/>
+        </w:rPr>
+        <w:t>Bouton "💰 Proposer un investissement"</w:t>
+      </w:r>
+      <w:r>
+        <w:rPr>
+          <w:rFonts w:ascii="Times New Roman" w:hAnsi="Times New Roman"/>
+          <w:b w:val="0"/>
+          <w:i w:val="0"/>
+          <w:sz w:val="21"/>
+        </w:rPr>
+        <w:t xml:space="preserve"> visible uniquement pour les Investisseurs → crée un </w:t>
+      </w:r>
+      <w:r>
+        <w:rPr>
+          <w:rFonts w:ascii="Times New Roman" w:hAnsi="Times New Roman"/>
+          <w:b w:val="0"/>
+          <w:i w:val="0"/>
+          <w:sz w:val="21"/>
+        </w:rPr>
+        <w:t>MentorRequest</w:t>
+      </w:r>
+      <w:r>
+        <w:rPr>
+          <w:rFonts w:ascii="Times New Roman" w:hAnsi="Times New Roman"/>
+          <w:b w:val="0"/>
+          <w:i w:val="0"/>
+          <w:sz w:val="21"/>
+        </w:rPr>
+        <w:t xml:space="preserve"> de type </w:t>
+      </w:r>
+      <w:r>
+        <w:rPr>
+          <w:rFonts w:ascii="Times New Roman" w:hAnsi="Times New Roman"/>
+          <w:b w:val="0"/>
+          <w:i w:val="0"/>
+          <w:sz w:val="21"/>
+        </w:rPr>
+        <w:t>'investment'</w:t>
+      </w:r>
+      <w:r>
+        <w:rPr>
+          <w:rFonts w:ascii="Times New Roman" w:hAnsi="Times New Roman"/>
+          <w:b w:val="0"/>
+          <w:i w:val="0"/>
+          <w:sz w:val="21"/>
+        </w:rPr>
+        <w:t xml:space="preserve"> dans Firebase + notification automatique à l'entrepreneur</w:t>
       </w:r>
     </w:p>
     <w:p>
@@ -8869,7 +10105,25 @@
           <w:i w:val="0"/>
           <w:sz w:val="21"/>
         </w:rPr>
-        <w:t>Sessions à venir + passées depuis Firebase</w:t>
+        <w:t xml:space="preserve">Sessions </w:t>
+      </w:r>
+      <w:r>
+        <w:rPr>
+          <w:rFonts w:ascii="Times New Roman" w:hAnsi="Times New Roman"/>
+          <w:b w:val="0"/>
+          <w:i w:val="0"/>
+          <w:sz w:val="21"/>
+        </w:rPr>
+        <w:t>à venir uniquement</w:t>
+      </w:r>
+      <w:r>
+        <w:rPr>
+          <w:rFonts w:ascii="Times New Roman" w:hAnsi="Times New Roman"/>
+          <w:b w:val="0"/>
+          <w:i w:val="0"/>
+          <w:sz w:val="21"/>
+        </w:rPr>
+        <w:t xml:space="preserve"> depuis Firebase (pas de section "Passées" — pas de suivi de complétion en base)</w:t>
       </w:r>
     </w:p>
     <w:p>
@@ -8884,6 +10138,47 @@
           <w:sz w:val="21"/>
         </w:rPr>
         <w:t>Bouton "Mon Planning" dans l'AppBar (Mentor uniquement)</w:t>
+      </w:r>
+    </w:p>
+    <w:p>
+      <w:pPr>
+        <w:pStyle w:val="ListBullet"/>
+      </w:pPr>
+      <w:r>
+        <w:rPr>
+          <w:rFonts w:ascii="Times New Roman" w:hAnsi="Times New Roman"/>
+          <w:b w:val="0"/>
+          <w:i w:val="0"/>
+          <w:sz w:val="21"/>
+        </w:rPr>
+        <w:t>Bouton "Annuler"</w:t>
+      </w:r>
+      <w:r>
+        <w:rPr>
+          <w:rFonts w:ascii="Times New Roman" w:hAnsi="Times New Roman"/>
+          <w:b w:val="0"/>
+          <w:i w:val="0"/>
+          <w:sz w:val="21"/>
+        </w:rPr>
+        <w:t xml:space="preserve"> sur chaque session réservée : dialog de confirmation → </w:t>
+      </w:r>
+      <w:r>
+        <w:rPr>
+          <w:rFonts w:ascii="Times New Roman" w:hAnsi="Times New Roman"/>
+          <w:b w:val="0"/>
+          <w:i w:val="0"/>
+          <w:sz w:val="21"/>
+        </w:rPr>
+        <w:t>AgendaController.cancel()</w:t>
+      </w:r>
+      <w:r>
+        <w:rPr>
+          <w:rFonts w:ascii="Times New Roman" w:hAnsi="Times New Roman"/>
+          <w:b w:val="0"/>
+          <w:i w:val="0"/>
+          <w:sz w:val="21"/>
+        </w:rPr>
+        <w:t xml:space="preserve"> bilatéral</w:t>
       </w:r>
     </w:p>
     <w:p>
@@ -11646,7 +12941,7 @@
                 <w:i w:val="0"/>
                 <w:sz w:val="19"/>
               </w:rPr>
-              <w:t>Matching (100+ profils), Pitchs publiés, Messages</w:t>
+              <w:t>Matching (112 profils), Pitchs publiés, Messages</w:t>
             </w:r>
           </w:p>
         </w:tc>
@@ -12321,6 +13616,316 @@
                 <w:sz w:val="19"/>
               </w:rPr>
               <w:t>Composants partagés dans toute l'app</w:t>
+            </w:r>
+          </w:p>
+        </w:tc>
+        <w:tc>
+          <w:tcPr>
+            <w:tcW w:type="dxa" w:w="3024"/>
+            <w:vAlign w:val="center"/>
+          </w:tcPr>
+          <w:p>
+            <w:pPr>
+              <w:spacing w:before="40" w:after="40"/>
+            </w:pPr>
+            <w:r>
+              <w:rPr>
+                <w:rFonts w:ascii="Times New Roman" w:hAnsi="Times New Roman"/>
+                <w:b w:val="0"/>
+                <w:i w:val="0"/>
+                <w:sz w:val="19"/>
+              </w:rPr>
+              <w:t>✅</w:t>
+            </w:r>
+          </w:p>
+        </w:tc>
+      </w:tr>
+      <w:tr>
+        <w:tc>
+          <w:tcPr>
+            <w:tcW w:type="dxa" w:w="3024"/>
+            <w:vAlign w:val="center"/>
+          </w:tcPr>
+          <w:p>
+            <w:pPr>
+              <w:spacing w:before="40" w:after="40"/>
+            </w:pPr>
+            <w:r>
+              <w:rPr>
+                <w:rFonts w:ascii="Times New Roman" w:hAnsi="Times New Roman"/>
+                <w:b w:val="0"/>
+                <w:i w:val="0"/>
+                <w:sz w:val="19"/>
+              </w:rPr>
+              <w:t>Bonus — Matching rôle-adaptatif</w:t>
+            </w:r>
+          </w:p>
+        </w:tc>
+        <w:tc>
+          <w:tcPr>
+            <w:tcW w:type="dxa" w:w="3024"/>
+            <w:vAlign w:val="center"/>
+          </w:tcPr>
+          <w:p>
+            <w:pPr>
+              <w:spacing w:before="40" w:after="40"/>
+            </w:pPr>
+            <w:r>
+              <w:rPr>
+                <w:rFonts w:ascii="Times New Roman" w:hAnsi="Times New Roman"/>
+                <w:b w:val="0"/>
+                <w:i w:val="0"/>
+                <w:sz w:val="19"/>
+              </w:rPr>
+              <w:t>Titre et contenu selon le rôle connecté</w:t>
+            </w:r>
+          </w:p>
+        </w:tc>
+        <w:tc>
+          <w:tcPr>
+            <w:tcW w:type="dxa" w:w="3024"/>
+            <w:vAlign w:val="center"/>
+          </w:tcPr>
+          <w:p>
+            <w:pPr>
+              <w:spacing w:before="40" w:after="40"/>
+            </w:pPr>
+            <w:r>
+              <w:rPr>
+                <w:rFonts w:ascii="Times New Roman" w:hAnsi="Times New Roman"/>
+                <w:b w:val="0"/>
+                <w:i w:val="0"/>
+                <w:sz w:val="19"/>
+              </w:rPr>
+              <w:t>✅</w:t>
+            </w:r>
+          </w:p>
+        </w:tc>
+      </w:tr>
+      <w:tr>
+        <w:tc>
+          <w:tcPr>
+            <w:tcW w:type="dxa" w:w="3024"/>
+            <w:vAlign w:val="center"/>
+          </w:tcPr>
+          <w:p>
+            <w:pPr>
+              <w:spacing w:before="40" w:after="40"/>
+            </w:pPr>
+            <w:r>
+              <w:rPr>
+                <w:rFonts w:ascii="Times New Roman" w:hAnsi="Times New Roman"/>
+                <w:b w:val="0"/>
+                <w:i w:val="0"/>
+                <w:sz w:val="19"/>
+              </w:rPr>
+              <w:t>Bonus — Système de Contacts</w:t>
+            </w:r>
+          </w:p>
+        </w:tc>
+        <w:tc>
+          <w:tcPr>
+            <w:tcW w:type="dxa" w:w="3024"/>
+            <w:vAlign w:val="center"/>
+          </w:tcPr>
+          <w:p>
+            <w:pPr>
+              <w:spacing w:before="40" w:after="40"/>
+            </w:pPr>
+            <w:r>
+              <w:rPr>
+                <w:rFonts w:ascii="Times New Roman" w:hAnsi="Times New Roman"/>
+                <w:b w:val="0"/>
+                <w:i w:val="0"/>
+                <w:sz w:val="19"/>
+              </w:rPr>
+              <w:t>Onglet Contacts dans Messages (relations acceptées)</w:t>
+            </w:r>
+          </w:p>
+        </w:tc>
+        <w:tc>
+          <w:tcPr>
+            <w:tcW w:type="dxa" w:w="3024"/>
+            <w:vAlign w:val="center"/>
+          </w:tcPr>
+          <w:p>
+            <w:pPr>
+              <w:spacing w:before="40" w:after="40"/>
+            </w:pPr>
+            <w:r>
+              <w:rPr>
+                <w:rFonts w:ascii="Times New Roman" w:hAnsi="Times New Roman"/>
+                <w:b w:val="0"/>
+                <w:i w:val="0"/>
+                <w:sz w:val="19"/>
+              </w:rPr>
+              <w:t>✅</w:t>
+            </w:r>
+          </w:p>
+        </w:tc>
+      </w:tr>
+      <w:tr>
+        <w:tc>
+          <w:tcPr>
+            <w:tcW w:type="dxa" w:w="3024"/>
+            <w:vAlign w:val="center"/>
+          </w:tcPr>
+          <w:p>
+            <w:pPr>
+              <w:spacing w:before="40" w:after="40"/>
+            </w:pPr>
+            <w:r>
+              <w:rPr>
+                <w:rFonts w:ascii="Times New Roman" w:hAnsi="Times New Roman"/>
+                <w:b w:val="0"/>
+                <w:i w:val="0"/>
+                <w:sz w:val="19"/>
+              </w:rPr>
+              <w:t>Bonus — Flux investisseur</w:t>
+            </w:r>
+          </w:p>
+        </w:tc>
+        <w:tc>
+          <w:tcPr>
+            <w:tcW w:type="dxa" w:w="3024"/>
+            <w:vAlign w:val="center"/>
+          </w:tcPr>
+          <w:p>
+            <w:pPr>
+              <w:spacing w:before="40" w:after="40"/>
+            </w:pPr>
+            <w:r>
+              <w:rPr>
+                <w:rFonts w:ascii="Times New Roman" w:hAnsi="Times New Roman"/>
+                <w:b w:val="0"/>
+                <w:i w:val="0"/>
+                <w:sz w:val="19"/>
+              </w:rPr>
+              <w:t>Proposer un investissement + acceptation + relation Contacts</w:t>
+            </w:r>
+          </w:p>
+        </w:tc>
+        <w:tc>
+          <w:tcPr>
+            <w:tcW w:type="dxa" w:w="3024"/>
+            <w:vAlign w:val="center"/>
+          </w:tcPr>
+          <w:p>
+            <w:pPr>
+              <w:spacing w:before="40" w:after="40"/>
+            </w:pPr>
+            <w:r>
+              <w:rPr>
+                <w:rFonts w:ascii="Times New Roman" w:hAnsi="Times New Roman"/>
+                <w:b w:val="0"/>
+                <w:i w:val="0"/>
+                <w:sz w:val="19"/>
+              </w:rPr>
+              <w:t>✅</w:t>
+            </w:r>
+          </w:p>
+        </w:tc>
+      </w:tr>
+      <w:tr>
+        <w:tc>
+          <w:tcPr>
+            <w:tcW w:type="dxa" w:w="3024"/>
+            <w:vAlign w:val="center"/>
+          </w:tcPr>
+          <w:p>
+            <w:pPr>
+              <w:spacing w:before="40" w:after="40"/>
+            </w:pPr>
+            <w:r>
+              <w:rPr>
+                <w:rFonts w:ascii="Times New Roman" w:hAnsi="Times New Roman"/>
+                <w:b w:val="0"/>
+                <w:i w:val="0"/>
+                <w:sz w:val="19"/>
+              </w:rPr>
+              <w:t>Bonus — Filtres pitchs</w:t>
+            </w:r>
+          </w:p>
+        </w:tc>
+        <w:tc>
+          <w:tcPr>
+            <w:tcW w:type="dxa" w:w="3024"/>
+            <w:vAlign w:val="center"/>
+          </w:tcPr>
+          <w:p>
+            <w:pPr>
+              <w:spacing w:before="40" w:after="40"/>
+            </w:pPr>
+            <w:r>
+              <w:rPr>
+                <w:rFonts w:ascii="Times New Roman" w:hAnsi="Times New Roman"/>
+                <w:b w:val="0"/>
+                <w:i w:val="0"/>
+                <w:sz w:val="19"/>
+              </w:rPr>
+              <w:t>Barre de recherche + pills secteur dynamiques dans Pitchs Publiés</w:t>
+            </w:r>
+          </w:p>
+        </w:tc>
+        <w:tc>
+          <w:tcPr>
+            <w:tcW w:type="dxa" w:w="3024"/>
+            <w:vAlign w:val="center"/>
+          </w:tcPr>
+          <w:p>
+            <w:pPr>
+              <w:spacing w:before="40" w:after="40"/>
+            </w:pPr>
+            <w:r>
+              <w:rPr>
+                <w:rFonts w:ascii="Times New Roman" w:hAnsi="Times New Roman"/>
+                <w:b w:val="0"/>
+                <w:i w:val="0"/>
+                <w:sz w:val="19"/>
+              </w:rPr>
+              <w:t>✅</w:t>
+            </w:r>
+          </w:p>
+        </w:tc>
+      </w:tr>
+      <w:tr>
+        <w:tc>
+          <w:tcPr>
+            <w:tcW w:type="dxa" w:w="3024"/>
+            <w:vAlign w:val="center"/>
+          </w:tcPr>
+          <w:p>
+            <w:pPr>
+              <w:spacing w:before="40" w:after="40"/>
+            </w:pPr>
+            <w:r>
+              <w:rPr>
+                <w:rFonts w:ascii="Times New Roman" w:hAnsi="Times New Roman"/>
+                <w:b w:val="0"/>
+                <w:i w:val="0"/>
+                <w:sz w:val="19"/>
+              </w:rPr>
+              <w:t>Bonus — Annulation session</w:t>
+            </w:r>
+          </w:p>
+        </w:tc>
+        <w:tc>
+          <w:tcPr>
+            <w:tcW w:type="dxa" w:w="3024"/>
+            <w:vAlign w:val="center"/>
+          </w:tcPr>
+          <w:p>
+            <w:pPr>
+              <w:spacing w:before="40" w:after="40"/>
+            </w:pPr>
+            <w:r>
+              <w:rPr>
+                <w:rFonts w:ascii="Times New Roman" w:hAnsi="Times New Roman"/>
+                <w:b w:val="0"/>
+                <w:i w:val="0"/>
+                <w:sz w:val="19"/>
+              </w:rPr>
+              <w:t>Bouton "Annuler" avec confirmation dans l'Agenda</w:t>
             </w:r>
           </w:p>
         </w:tc>

</xml_diff>